<commit_message>
Reorder portfolio to 9 works and build out Sunset + Chasing Stars pages
Insert new film (Sunset) as work #1 and new game (Chasing Stars) as
work #3, shifting the existing seven projects into their new slots
across index.html, all-projects.html, and every work page's prev/next
nav. Home page and all-projects mosaic covers/labels updated to match.

Sunset (work-1.html): full page built from Figma via the API - exact
fonts/colors, character illustrations, mountain/cloud scene, process
art texture with shadow layer, and the embedded YouTube video.

Chasing Stars (work-3.html): hero video, frame-by-frame animated title
logo (43 PNG frames looping), and full game info (story, description,
screenshots, controls, credits) pulled from the live itch.io page,
since itch.io blocks iframe embedding via CSP.

Co-Authored-By: Claude Sonnet 5 <noreply@anthropic.com>
</commit_message>
<xml_diff>
--- a/my_web/CV- Oren Hen 2026.docx
+++ b/my_web/CV- Oren Hen 2026.docx
@@ -4,249 +4,27 @@
   <w:body>
     <w:p>
       <w:pPr>
-        <w:spacing w:after="56" w:line="259" w:lineRule="auto"/>
-        <w:ind w:left="3427" w:firstLine="0"/>
-      </w:pPr>
-      <w:r>
-        <w:rPr>
-          <w:rFonts w:ascii="Miriam" w:eastAsia="Miriam" w:hAnsi="Miriam" w:cs="Miriam"/>
-          <w:sz w:val="32"/>
-        </w:rPr>
-        <w:t xml:space="preserve">Animator &amp; Motion Designer </w:t>
-      </w:r>
-    </w:p>
-    <w:p>
-      <w:pPr>
-        <w:ind w:left="10"/>
-      </w:pPr>
-      <w:r>
-        <w:t xml:space="preserve">2D/3D animator specializing in motion graphics, visual storytelling, and AI-assisted animation workflows. </w:t>
-      </w:r>
-    </w:p>
-    <w:p>
-      <w:pPr>
-        <w:ind w:left="10"/>
-      </w:pPr>
-      <w:r>
-        <w:t xml:space="preserve">Experienced with After Effects, Maya, Blender, and generative AI tools for creative production. </w:t>
-      </w:r>
-    </w:p>
-    <w:p>
-      <w:pPr>
-        <w:spacing w:after="77" w:line="259" w:lineRule="auto"/>
-        <w:ind w:left="3427" w:firstLine="0"/>
-      </w:pPr>
-      <w:r>
-        <w:rPr>
-          <w:rFonts w:ascii="Arial" w:eastAsia="Arial" w:hAnsi="Arial" w:cs="Arial"/>
-          <w:b/>
-          <w:sz w:val="18"/>
-        </w:rPr>
-        <w:t xml:space="preserve"> </w:t>
-      </w:r>
-    </w:p>
-    <w:p>
-      <w:pPr>
-        <w:spacing w:after="39" w:line="259" w:lineRule="auto"/>
-        <w:ind w:left="3427" w:firstLine="0"/>
-      </w:pPr>
-      <w:hyperlink r:id="rId4">
-        <w:r>
-          <w:rPr>
-            <w:rFonts w:ascii="Miriam" w:eastAsia="Miriam" w:hAnsi="Miriam" w:cs="Miriam"/>
-            <w:color w:val="0563C1"/>
-            <w:u w:val="single" w:color="0563C1"/>
-          </w:rPr>
-          <w:t>My portfolio</w:t>
-        </w:r>
-      </w:hyperlink>
-      <w:hyperlink r:id="rId5">
-        <w:r>
-          <w:rPr>
-            <w:rFonts w:ascii="Miriam" w:eastAsia="Miriam" w:hAnsi="Miriam" w:cs="Miriam"/>
-          </w:rPr>
-          <w:t xml:space="preserve"> </w:t>
-        </w:r>
-      </w:hyperlink>
-      <w:r>
-        <w:rPr>
-          <w:rFonts w:ascii="Miriam" w:eastAsia="Miriam" w:hAnsi="Miriam" w:cs="Miriam"/>
-        </w:rPr>
-        <w:t xml:space="preserve"> </w:t>
-      </w:r>
-    </w:p>
-    <w:p>
-      <w:pPr>
-        <w:spacing w:after="138" w:line="259" w:lineRule="auto"/>
-        <w:ind w:left="3427" w:firstLine="0"/>
-      </w:pPr>
-      <w:r>
-        <w:rPr>
-          <w:b/>
-          <w:sz w:val="18"/>
-        </w:rPr>
-        <w:t xml:space="preserve"> </w:t>
-      </w:r>
-    </w:p>
-    <w:p>
-      <w:pPr>
-        <w:pStyle w:val="Heading1"/>
-        <w:ind w:left="10"/>
-      </w:pPr>
-      <w:r>
-        <w:t>EXPERIENCE</w:t>
-      </w:r>
-      <w:r>
-        <w:rPr>
-          <w:rFonts w:ascii="Arial" w:eastAsia="Arial" w:hAnsi="Arial" w:cs="Arial"/>
-          <w:b w:val="0"/>
-        </w:rPr>
-        <w:t xml:space="preserve"> </w:t>
-      </w:r>
-    </w:p>
-    <w:p>
-      <w:pPr>
-        <w:spacing w:after="12" w:line="259" w:lineRule="auto"/>
-        <w:ind w:left="3427" w:firstLine="0"/>
-      </w:pPr>
-      <w:r>
-        <w:rPr>
-          <w:rFonts w:ascii="Britannic" w:eastAsia="Britannic" w:hAnsi="Britannic" w:cs="Britannic"/>
-          <w:b/>
-          <w:sz w:val="32"/>
-        </w:rPr>
-        <w:t xml:space="preserve"> </w:t>
-      </w:r>
-    </w:p>
-    <w:p>
-      <w:pPr>
-        <w:spacing w:after="15" w:line="259" w:lineRule="auto"/>
-        <w:ind w:left="3427" w:firstLine="0"/>
-      </w:pPr>
-      <w:r>
-        <w:rPr>
-          <w:b/>
-          <w:sz w:val="28"/>
-        </w:rPr>
-        <w:t>Freelance</w:t>
-      </w:r>
-      <w:r>
-        <w:rPr>
-          <w:sz w:val="28"/>
-        </w:rPr>
-        <w:t xml:space="preserve"> </w:t>
-      </w:r>
-    </w:p>
-    <w:p>
-      <w:pPr>
-        <w:ind w:left="10"/>
-      </w:pPr>
-      <w:r>
-        <w:t>Moofa Studio</w:t>
-      </w:r>
-      <w:r>
-        <w:rPr>
-          <w:sz w:val="28"/>
-        </w:rPr>
-        <w:t xml:space="preserve"> </w:t>
-      </w:r>
-    </w:p>
-    <w:p>
-      <w:pPr>
-        <w:pStyle w:val="Heading2"/>
-        <w:spacing w:after="0"/>
-        <w:ind w:left="10"/>
-      </w:pPr>
-      <w:r>
-        <w:rPr>
-          <w:b w:val="0"/>
-          <w:i/>
-        </w:rPr>
-        <w:t>2025 - Present</w:t>
-      </w:r>
-      <w:r>
-        <w:rPr>
-          <w:b w:val="0"/>
-          <w:sz w:val="28"/>
-        </w:rPr>
-        <w:t xml:space="preserve"> </w:t>
-      </w:r>
-    </w:p>
-    <w:p>
-      <w:pPr>
-        <w:ind w:left="10"/>
-      </w:pPr>
-      <w:r>
-        <w:t>Develop animated content using a workflow that combines classical animation, After Effects, and AI-based generative tools. Translate creative concepts into visual sequences through staging, animation, and editing, while exploring AI-assisted creative processes alongside studies in the Animation Department at Bezalel Academy of Arts and Design.</w:t>
-      </w:r>
-      <w:r>
-        <w:rPr>
-          <w:rFonts w:ascii="Arial" w:eastAsia="Arial" w:hAnsi="Arial" w:cs="Arial"/>
-        </w:rPr>
-        <w:t xml:space="preserve"> </w:t>
-      </w:r>
-    </w:p>
-    <w:p>
-      <w:pPr>
-        <w:spacing w:after="19" w:line="259" w:lineRule="auto"/>
-        <w:ind w:left="3427" w:firstLine="0"/>
-      </w:pPr>
-      <w:r>
-        <w:t xml:space="preserve"> </w:t>
-      </w:r>
-    </w:p>
-    <w:p>
-      <w:pPr>
-        <w:pStyle w:val="Heading2"/>
-        <w:ind w:left="10"/>
-      </w:pPr>
-      <w:r>
-        <w:t xml:space="preserve">Student Mentorship </w:t>
-      </w:r>
-    </w:p>
-    <w:p>
-      <w:pPr>
-        <w:pStyle w:val="Heading3"/>
-        <w:ind w:left="10"/>
-      </w:pPr>
-      <w:r>
-        <w:t>2025- present</w:t>
-      </w:r>
-      <w:r>
-        <w:rPr>
-          <w:b/>
-          <w:i w:val="0"/>
-        </w:rPr>
-        <w:t xml:space="preserve"> </w:t>
-      </w:r>
-      <w:r>
-        <w:rPr>
-          <w:i w:val="0"/>
-        </w:rPr>
-        <w:t xml:space="preserve"> </w:t>
-      </w:r>
-    </w:p>
-    <w:p>
-      <w:pPr>
-        <w:ind w:left="10"/>
+        <w:spacing w:after="56" w:line="240" w:lineRule="auto"/>
+        <w:ind w:left="0" w:firstLine="0"/>
       </w:pPr>
       <w:r>
         <w:rPr>
           <w:noProof/>
-          <w:sz w:val="22"/>
+          <w:sz w:val="32"/>
+          <w:szCs w:val="32"/>
         </w:rPr>
         <mc:AlternateContent>
           <mc:Choice Requires="wpg">
             <w:drawing>
-              <wp:anchor distT="0" distB="0" distL="114300" distR="114300" simplePos="0" relativeHeight="251658240" behindDoc="0" locked="0" layoutInCell="1" allowOverlap="1">
+              <wp:anchor distT="0" distB="0" distL="114300" distR="114300" simplePos="0" relativeHeight="251658240" behindDoc="0" locked="0" layoutInCell="1" allowOverlap="1" wp14:anchorId="5D5359A3" wp14:editId="4319E8BA">
                 <wp:simplePos x="0" y="0"/>
                 <wp:positionH relativeFrom="page">
-                  <wp:posOffset>237490</wp:posOffset>
+                  <wp:posOffset>238836</wp:posOffset>
                 </wp:positionH>
                 <wp:positionV relativeFrom="page">
                   <wp:posOffset>0</wp:posOffset>
                 </wp:positionV>
-                <wp:extent cx="2376805" cy="10693395"/>
+                <wp:extent cx="2608580" cy="10692765"/>
                 <wp:effectExtent l="0" t="0" r="0" b="0"/>
                 <wp:wrapSquare wrapText="bothSides"/>
                 <wp:docPr id="1509" name="Group 1509"/>
@@ -258,9 +36,9 @@
                       <wpg:grpSpPr>
                         <a:xfrm>
                           <a:off x="0" y="0"/>
-                          <a:ext cx="2376805" cy="10693395"/>
+                          <a:ext cx="2608580" cy="10692765"/>
                           <a:chOff x="0" y="0"/>
-                          <a:chExt cx="2376805" cy="10693395"/>
+                          <a:chExt cx="2608793" cy="10693395"/>
                         </a:xfrm>
                       </wpg:grpSpPr>
                       <wps:wsp>
@@ -1201,27 +979,39 @@
                         <wps:spPr>
                           <a:xfrm>
                             <a:off x="159702" y="4856099"/>
-                            <a:ext cx="1004677" cy="172044"/>
-                          </a:xfrm>
-                          <a:prstGeom prst="rect">
-                            <a:avLst/>
-                          </a:prstGeom>
-                          <a:ln>
-                            <a:noFill/>
-                          </a:ln>
-                        </wps:spPr>
-                        <wps:txbx>
-                          <w:txbxContent>
-                            <w:p>
-                              <w:pPr>
-                                <w:spacing w:after="160" w:line="259" w:lineRule="auto"/>
-                                <w:ind w:left="0" w:firstLine="0"/>
-                              </w:pPr>
-                              <w:r>
-                                <w:rPr>
-                                  <w:sz w:val="20"/>
-                                </w:rPr>
-                                <w:t xml:space="preserve">Vibe coding in </w:t>
+                            <a:ext cx="2058240" cy="172044"/>
+                          </a:xfrm>
+                          <a:prstGeom prst="rect">
+                            <a:avLst/>
+                          </a:prstGeom>
+                          <a:ln>
+                            <a:noFill/>
+                          </a:ln>
+                        </wps:spPr>
+                        <wps:txbx>
+                          <w:txbxContent>
+                            <w:p>
+                              <w:pPr>
+                                <w:spacing w:after="160" w:line="259" w:lineRule="auto"/>
+                                <w:ind w:left="0" w:firstLine="0"/>
+                                <w:rPr>
+                                  <w:sz w:val="20"/>
+                                  <w:szCs w:val="20"/>
+                                </w:rPr>
+                              </w:pPr>
+                              <w:r>
+                                <w:rPr>
+                                  <w:sz w:val="20"/>
+                                  <w:szCs w:val="20"/>
+                                </w:rPr>
+                                <w:t>Full control in</w:t>
+                              </w:r>
+                              <w:r>
+                                <w:rPr>
+                                  <w:sz w:val="20"/>
+                                  <w:szCs w:val="20"/>
+                                </w:rPr>
+                                <w:t xml:space="preserve"> Comfy UI</w:t>
                               </w:r>
                             </w:p>
                           </w:txbxContent>
@@ -1235,64 +1025,23 @@
                         <wps:cNvSpPr/>
                         <wps:spPr>
                           <a:xfrm>
-                            <a:off x="915670" y="4856099"/>
-                            <a:ext cx="90029" cy="172044"/>
-                          </a:xfrm>
-                          <a:prstGeom prst="rect">
-                            <a:avLst/>
-                          </a:prstGeom>
-                          <a:ln>
-                            <a:noFill/>
-                          </a:ln>
-                        </wps:spPr>
-                        <wps:txbx>
-                          <w:txbxContent>
-                            <w:p>
-                              <w:pPr>
-                                <w:spacing w:after="160" w:line="259" w:lineRule="auto"/>
-                                <w:ind w:left="0" w:firstLine="0"/>
-                              </w:pPr>
-                              <w:r>
-                                <w:rPr>
-                                  <w:sz w:val="20"/>
-                                </w:rPr>
-                                <w:t>C</w:t>
-                              </w:r>
-                            </w:p>
-                          </w:txbxContent>
-                        </wps:txbx>
-                        <wps:bodyPr horzOverflow="overflow" vert="horz" lIns="0" tIns="0" rIns="0" bIns="0" rtlCol="0">
-                          <a:noAutofit/>
-                        </wps:bodyPr>
-                      </wps:wsp>
-                      <wps:wsp>
-                        <wps:cNvPr id="34" name="Rectangle 34"/>
-                        <wps:cNvSpPr/>
-                        <wps:spPr>
-                          <a:xfrm>
-                            <a:off x="982345" y="4856099"/>
-                            <a:ext cx="363157" cy="172044"/>
-                          </a:xfrm>
-                          <a:prstGeom prst="rect">
-                            <a:avLst/>
-                          </a:prstGeom>
-                          <a:ln>
-                            <a:noFill/>
-                          </a:ln>
-                        </wps:spPr>
-                        <wps:txbx>
-                          <w:txbxContent>
-                            <w:p>
-                              <w:pPr>
-                                <w:spacing w:after="160" w:line="259" w:lineRule="auto"/>
-                                <w:ind w:left="0" w:firstLine="0"/>
-                              </w:pPr>
-                              <w:r>
-                                <w:rPr>
-                                  <w:sz w:val="20"/>
-                                </w:rPr>
-                                <w:t>ursor</w:t>
-                              </w:r>
+                            <a:off x="1156969" y="4855813"/>
+                            <a:ext cx="600456" cy="172044"/>
+                          </a:xfrm>
+                          <a:prstGeom prst="rect">
+                            <a:avLst/>
+                          </a:prstGeom>
+                          <a:ln>
+                            <a:noFill/>
+                          </a:ln>
+                        </wps:spPr>
+                        <wps:txbx>
+                          <w:txbxContent>
+                            <w:p>
+                              <w:pPr>
+                                <w:spacing w:after="160" w:line="259" w:lineRule="auto"/>
+                                <w:ind w:left="0" w:firstLine="0"/>
+                              </w:pPr>
                             </w:p>
                           </w:txbxContent>
                         </wps:txbx>
@@ -1708,12 +1457,14 @@
                                 <w:spacing w:after="160" w:line="259" w:lineRule="auto"/>
                                 <w:ind w:left="0" w:firstLine="0"/>
                               </w:pPr>
+                              <w:proofErr w:type="spellStart"/>
                               <w:r>
                                 <w:rPr>
                                   <w:sz w:val="20"/>
                                 </w:rPr>
                                 <w:t>Substan</w:t>
                               </w:r>
+                              <w:proofErr w:type="spellEnd"/>
                             </w:p>
                           </w:txbxContent>
                         </wps:txbx>
@@ -1743,11 +1494,19 @@
                                 <w:spacing w:after="160" w:line="259" w:lineRule="auto"/>
                                 <w:ind w:left="0" w:firstLine="0"/>
                               </w:pPr>
-                              <w:r>
-                                <w:rPr>
-                                  <w:sz w:val="20"/>
-                                </w:rPr>
-                                <w:t xml:space="preserve">ce </w:t>
+                              <w:proofErr w:type="spellStart"/>
+                              <w:r>
+                                <w:rPr>
+                                  <w:sz w:val="20"/>
+                                </w:rPr>
+                                <w:t>ce</w:t>
+                              </w:r>
+                              <w:proofErr w:type="spellEnd"/>
+                              <w:r>
+                                <w:rPr>
+                                  <w:sz w:val="20"/>
+                                </w:rPr>
+                                <w:t xml:space="preserve"> </w:t>
                               </w:r>
                             </w:p>
                           </w:txbxContent>
@@ -1903,27 +1662,65 @@
                         <wps:spPr>
                           <a:xfrm>
                             <a:off x="197803" y="5786374"/>
-                            <a:ext cx="1856997" cy="172044"/>
-                          </a:xfrm>
-                          <a:prstGeom prst="rect">
-                            <a:avLst/>
-                          </a:prstGeom>
-                          <a:ln>
-                            <a:noFill/>
-                          </a:ln>
-                        </wps:spPr>
-                        <wps:txbx>
-                          <w:txbxContent>
-                            <w:p>
-                              <w:pPr>
-                                <w:spacing w:after="160" w:line="259" w:lineRule="auto"/>
-                                <w:ind w:left="0" w:firstLine="0"/>
-                              </w:pPr>
-                              <w:r>
-                                <w:rPr>
-                                  <w:sz w:val="20"/>
-                                </w:rPr>
-                                <w:t>D Animation: MayaBlender</w:t>
+                            <a:ext cx="2095208" cy="172044"/>
+                          </a:xfrm>
+                          <a:prstGeom prst="rect">
+                            <a:avLst/>
+                          </a:prstGeom>
+                          <a:ln>
+                            <a:noFill/>
+                          </a:ln>
+                        </wps:spPr>
+                        <wps:txbx>
+                          <w:txbxContent>
+                            <w:p>
+                              <w:pPr>
+                                <w:spacing w:after="160" w:line="259" w:lineRule="auto"/>
+                                <w:ind w:left="0" w:firstLine="0"/>
+                              </w:pPr>
+                              <w:proofErr w:type="gramStart"/>
+                              <w:r>
+                                <w:rPr>
+                                  <w:sz w:val="20"/>
+                                </w:rPr>
+                                <w:t>D</w:t>
+                              </w:r>
+                              <w:r>
+                                <w:rPr>
+                                  <w:sz w:val="20"/>
+                                </w:rPr>
+                                <w:t xml:space="preserve"> </w:t>
+                              </w:r>
+                              <w:r>
+                                <w:rPr>
+                                  <w:sz w:val="20"/>
+                                </w:rPr>
+                                <w:t>:</w:t>
+                              </w:r>
+                              <w:proofErr w:type="gramEnd"/>
+                              <w:r>
+                                <w:rPr>
+                                  <w:sz w:val="20"/>
+                                </w:rPr>
+                                <w:t xml:space="preserve"> Maya</w:t>
+                              </w:r>
+                              <w:r>
+                                <w:rPr>
+                                  <w:sz w:val="20"/>
+                                </w:rPr>
+                                <w:t xml:space="preserve">, </w:t>
+                              </w:r>
+                              <w:r>
+                                <w:rPr>
+                                  <w:sz w:val="20"/>
+                                </w:rPr>
+                                <w:t>Blender</w:t>
+                              </w:r>
+                              <w:r>
+                                <w:rPr>
+                                  <w:sz w:val="20"/>
+                                </w:rPr>
+                                <w:t>, Unreal Engine, Unity</w:t>
                               </w:r>
                             </w:p>
                           </w:txbxContent>
@@ -2199,11 +1996,19 @@
                                 <w:spacing w:after="160" w:line="259" w:lineRule="auto"/>
                                 <w:ind w:left="0" w:firstLine="0"/>
                               </w:pPr>
-                              <w:r>
-                                <w:rPr>
-                                  <w:sz w:val="20"/>
-                                </w:rPr>
-                                <w:t xml:space="preserve">Run Way, </w:t>
+                              <w:proofErr w:type="gramStart"/>
+                              <w:r>
+                                <w:rPr>
+                                  <w:sz w:val="20"/>
+                                </w:rPr>
+                                <w:t>Run Way</w:t>
+                              </w:r>
+                              <w:proofErr w:type="gramEnd"/>
+                              <w:r>
+                                <w:rPr>
+                                  <w:sz w:val="20"/>
+                                </w:rPr>
+                                <w:t xml:space="preserve">, </w:t>
                               </w:r>
                             </w:p>
                           </w:txbxContent>
@@ -2218,28 +2023,36 @@
                         <wps:spPr>
                           <a:xfrm>
                             <a:off x="1156970" y="6018530"/>
-                            <a:ext cx="798269" cy="172044"/>
-                          </a:xfrm>
-                          <a:prstGeom prst="rect">
-                            <a:avLst/>
-                          </a:prstGeom>
-                          <a:ln>
-                            <a:noFill/>
-                          </a:ln>
-                        </wps:spPr>
-                        <wps:txbx>
-                          <w:txbxContent>
-                            <w:p>
-                              <w:pPr>
-                                <w:spacing w:after="160" w:line="259" w:lineRule="auto"/>
-                                <w:ind w:left="0" w:firstLine="0"/>
-                              </w:pPr>
+                            <a:ext cx="1368072" cy="172044"/>
+                          </a:xfrm>
+                          <a:prstGeom prst="rect">
+                            <a:avLst/>
+                          </a:prstGeom>
+                          <a:ln>
+                            <a:noFill/>
+                          </a:ln>
+                        </wps:spPr>
+                        <wps:txbx>
+                          <w:txbxContent>
+                            <w:p>
+                              <w:pPr>
+                                <w:spacing w:after="160" w:line="259" w:lineRule="auto"/>
+                                <w:ind w:left="0" w:firstLine="0"/>
+                              </w:pPr>
+                              <w:proofErr w:type="gramStart"/>
                               <w:r>
                                 <w:rPr>
                                   <w:sz w:val="20"/>
                                 </w:rPr>
                                 <w:t>Midjourney</w:t>
                               </w:r>
+                              <w:r>
+                                <w:rPr>
+                                  <w:sz w:val="20"/>
+                                </w:rPr>
+                                <w:t xml:space="preserve">  Kling</w:t>
+                              </w:r>
+                              <w:proofErr w:type="gramEnd"/>
                             </w:p>
                           </w:txbxContent>
                         </wps:txbx>
@@ -2273,7 +2086,7 @@
                                 <w:rPr>
                                   <w:sz w:val="20"/>
                                 </w:rPr>
-                                <w:t xml:space="preserve"> </w:t>
+                                <w:t>, f</w:t>
                               </w:r>
                             </w:p>
                           </w:txbxContent>
@@ -3145,12 +2958,14 @@
                                 <w:spacing w:after="160" w:line="259" w:lineRule="auto"/>
                                 <w:ind w:left="0" w:firstLine="0"/>
                               </w:pPr>
+                              <w:proofErr w:type="spellStart"/>
                               <w:r>
                                 <w:rPr>
                                   <w:sz w:val="20"/>
                                 </w:rPr>
                                 <w:t>el</w:t>
                               </w:r>
+                              <w:proofErr w:type="spellEnd"/>
                             </w:p>
                           </w:txbxContent>
                         </wps:txbx>
@@ -3618,6 +3433,48 @@
                       <pic:pic xmlns:pic="http://schemas.openxmlformats.org/drawingml/2006/picture">
                         <pic:nvPicPr>
                           <pic:cNvPr id="99" name="Picture 99"/>
+                          <pic:cNvPicPr/>
+                        </pic:nvPicPr>
+                        <pic:blipFill>
+                          <a:blip r:embed="rId4"/>
+                          <a:stretch>
+                            <a:fillRect/>
+                          </a:stretch>
+                        </pic:blipFill>
+                        <pic:spPr>
+                          <a:xfrm>
+                            <a:off x="111125" y="1895475"/>
+                            <a:ext cx="136525" cy="136525"/>
+                          </a:xfrm>
+                          <a:prstGeom prst="rect">
+                            <a:avLst/>
+                          </a:prstGeom>
+                        </pic:spPr>
+                      </pic:pic>
+                      <pic:pic xmlns:pic="http://schemas.openxmlformats.org/drawingml/2006/picture">
+                        <pic:nvPicPr>
+                          <pic:cNvPr id="101" name="Picture 101"/>
+                          <pic:cNvPicPr/>
+                        </pic:nvPicPr>
+                        <pic:blipFill>
+                          <a:blip r:embed="rId5"/>
+                          <a:stretch>
+                            <a:fillRect/>
+                          </a:stretch>
+                        </pic:blipFill>
+                        <pic:spPr>
+                          <a:xfrm>
+                            <a:off x="114935" y="2533650"/>
+                            <a:ext cx="136525" cy="190500"/>
+                          </a:xfrm>
+                          <a:prstGeom prst="rect">
+                            <a:avLst/>
+                          </a:prstGeom>
+                        </pic:spPr>
+                      </pic:pic>
+                      <pic:pic xmlns:pic="http://schemas.openxmlformats.org/drawingml/2006/picture">
+                        <pic:nvPicPr>
+                          <pic:cNvPr id="103" name="Picture 103"/>
                           <pic:cNvPicPr/>
                         </pic:nvPicPr>
                         <pic:blipFill>
@@ -3628,48 +3485,6 @@
                         </pic:blipFill>
                         <pic:spPr>
                           <a:xfrm>
-                            <a:off x="111125" y="1895475"/>
-                            <a:ext cx="136525" cy="136525"/>
-                          </a:xfrm>
-                          <a:prstGeom prst="rect">
-                            <a:avLst/>
-                          </a:prstGeom>
-                        </pic:spPr>
-                      </pic:pic>
-                      <pic:pic xmlns:pic="http://schemas.openxmlformats.org/drawingml/2006/picture">
-                        <pic:nvPicPr>
-                          <pic:cNvPr id="101" name="Picture 101"/>
-                          <pic:cNvPicPr/>
-                        </pic:nvPicPr>
-                        <pic:blipFill>
-                          <a:blip r:embed="rId7"/>
-                          <a:stretch>
-                            <a:fillRect/>
-                          </a:stretch>
-                        </pic:blipFill>
-                        <pic:spPr>
-                          <a:xfrm>
-                            <a:off x="114935" y="2533650"/>
-                            <a:ext cx="136525" cy="190500"/>
-                          </a:xfrm>
-                          <a:prstGeom prst="rect">
-                            <a:avLst/>
-                          </a:prstGeom>
-                        </pic:spPr>
-                      </pic:pic>
-                      <pic:pic xmlns:pic="http://schemas.openxmlformats.org/drawingml/2006/picture">
-                        <pic:nvPicPr>
-                          <pic:cNvPr id="103" name="Picture 103"/>
-                          <pic:cNvPicPr/>
-                        </pic:nvPicPr>
-                        <pic:blipFill>
-                          <a:blip r:embed="rId8"/>
-                          <a:stretch>
-                            <a:fillRect/>
-                          </a:stretch>
-                        </pic:blipFill>
-                        <pic:spPr>
-                          <a:xfrm>
                             <a:off x="109855" y="2211705"/>
                             <a:ext cx="136525" cy="158750"/>
                           </a:xfrm>
@@ -4177,23 +3992,26 @@
                     </wpg:wgp>
                   </a:graphicData>
                 </a:graphic>
+                <wp14:sizeRelH relativeFrom="margin">
+                  <wp14:pctWidth>0</wp14:pctWidth>
+                </wp14:sizeRelH>
               </wp:anchor>
             </w:drawing>
           </mc:Choice>
-          <mc:Fallback xmlns:a="http://schemas.openxmlformats.org/drawingml/2006/main">
+          <mc:Fallback>
             <w:pict>
-              <v:group id="Group 1509" style="width:187.15pt;height:842pt;position:absolute;mso-position-horizontal-relative:page;mso-position-horizontal:absolute;margin-left:18.7pt;mso-position-vertical-relative:page;margin-top:0pt;" coordsize="23768,106933">
-                <v:rect id="Rectangle 6" style="position:absolute;width:1314;height:4445;left:6772;top:9892;" filled="f" stroked="f">
-                  <v:textbox inset="0,0,0,0">
-                    <w:txbxContent>
-                      <w:p>
-                        <w:pPr>
-                          <w:spacing w:before="0" w:after="160" w:line="259" w:lineRule="auto"/>
-                          <w:ind w:left="0" w:firstLine="0"/>
-                        </w:pPr>
-                        <w:r>
-                          <w:rPr>
-                            <w:rFonts w:cs="Arial" w:hAnsi="Arial" w:eastAsia="Arial" w:ascii="Arial"/>
+              <v:group w14:anchorId="5D5359A3" id="Group 1509" o:spid="_x0000_s1026" style="position:absolute;margin-left:18.8pt;margin-top:0;width:205.4pt;height:841.95pt;z-index:251658240;mso-position-horizontal-relative:page;mso-position-vertical-relative:page;mso-width-relative:margin" coordsize="26087,106933" o:gfxdata="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">
+                <v:rect id="Rectangle 6" o:spid="_x0000_s1027" style="position:absolute;left:6772;top:9892;width:1315;height:4446;visibility:visible;mso-wrap-style:square;v-text-anchor:top" o:gfxdata="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" filled="f" stroked="f">
+                  <v:textbox inset="0,0,0,0">
+                    <w:txbxContent>
+                      <w:p>
+                        <w:pPr>
+                          <w:spacing w:after="160" w:line="259" w:lineRule="auto"/>
+                          <w:ind w:left="0" w:firstLine="0"/>
+                        </w:pPr>
+                        <w:r>
+                          <w:rPr>
+                            <w:rFonts w:ascii="Arial" w:eastAsia="Arial" w:hAnsi="Arial" w:cs="Arial"/>
                             <w:sz w:val="56"/>
                           </w:rPr>
                           <w:t xml:space="preserve"> </w:t>
@@ -4202,33 +4020,32 @@
                     </w:txbxContent>
                   </v:textbox>
                 </v:rect>
-                <v:rect id="Rectangle 7" style="position:absolute;width:458;height:2064;left:6772;top:13529;" filled="f" stroked="f">
-                  <v:textbox inset="0,0,0,0">
-                    <w:txbxContent>
-                      <w:p>
-                        <w:pPr>
-                          <w:spacing w:before="0" w:after="160" w:line="259" w:lineRule="auto"/>
-                          <w:ind w:left="0" w:firstLine="0"/>
-                        </w:pPr>
-                        <w:r>
-                          <w:rPr/>
+                <v:rect id="Rectangle 7" o:spid="_x0000_s1028" style="position:absolute;left:6772;top:13529;width:458;height:2064;visibility:visible;mso-wrap-style:square;v-text-anchor:top" o:gfxdata="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" filled="f" stroked="f">
+                  <v:textbox inset="0,0,0,0">
+                    <w:txbxContent>
+                      <w:p>
+                        <w:pPr>
+                          <w:spacing w:after="160" w:line="259" w:lineRule="auto"/>
+                          <w:ind w:left="0" w:firstLine="0"/>
+                        </w:pPr>
+                        <w:r>
                           <w:t xml:space="preserve"> </w:t>
                         </w:r>
                       </w:p>
                     </w:txbxContent>
                   </v:textbox>
                 </v:rect>
-                <v:rect id="Rectangle 8" style="position:absolute;width:563;height:1905;left:7121;top:13562;" filled="f" stroked="f">
-                  <v:textbox inset="0,0,0,0">
-                    <w:txbxContent>
-                      <w:p>
-                        <w:pPr>
-                          <w:spacing w:before="0" w:after="160" w:line="259" w:lineRule="auto"/>
-                          <w:ind w:left="0" w:firstLine="0"/>
-                        </w:pPr>
-                        <w:r>
-                          <w:rPr>
-                            <w:rFonts w:cs="Arial" w:hAnsi="Arial" w:eastAsia="Arial" w:ascii="Arial"/>
+                <v:rect id="Rectangle 8" o:spid="_x0000_s1029" style="position:absolute;left:7121;top:13562;width:564;height:1905;visibility:visible;mso-wrap-style:square;v-text-anchor:top" o:gfxdata="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" filled="f" stroked="f">
+                  <v:textbox inset="0,0,0,0">
+                    <w:txbxContent>
+                      <w:p>
+                        <w:pPr>
+                          <w:spacing w:after="160" w:line="259" w:lineRule="auto"/>
+                          <w:ind w:left="0" w:firstLine="0"/>
+                        </w:pPr>
+                        <w:r>
+                          <w:rPr>
+                            <w:rFonts w:ascii="Arial" w:eastAsia="Arial" w:hAnsi="Arial" w:cs="Arial"/>
                           </w:rPr>
                           <w:t xml:space="preserve"> </w:t>
                         </w:r>
@@ -4236,16 +4053,17 @@
                     </w:txbxContent>
                   </v:textbox>
                 </v:rect>
-                <v:shape id="Shape 1862" style="position:absolute;width:23768;height:106933;left:0;top:0;" coordsize="2376805,10693395" path="m0,0l2376805,0l2376805,10693395l0,10693395l0,0">
-                  <v:stroke weight="0pt" endcap="flat" joinstyle="miter" miterlimit="10" on="false" color="#000000" opacity="0"/>
-                  <v:fill on="true" color="#a9c5ff" opacity="0.8"/>
+                <v:shape id="Shape 1861" o:spid="_x0000_s1030" style="position:absolute;width:23768;height:106933;visibility:visible;mso-wrap-style:square;v-text-anchor:top" coordsize="2376805,10693395" o:gfxdata="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" path="m,l2376805,r,10693395l,10693395,,e" fillcolor="#a9c5ff" stroked="f" strokeweight="0">
+                  <v:fill opacity="52428f"/>
+                  <v:stroke miterlimit="83231f" joinstyle="miter"/>
+                  <v:path arrowok="t" textboxrect="0,0,2376805,10693395"/>
                 </v:shape>
-                <v:rect id="Rectangle 10" style="position:absolute;width:22503;height:1720;left:927;top:30236;" filled="f" stroked="f">
-                  <v:textbox inset="0,0,0,0">
-                    <w:txbxContent>
-                      <w:p>
-                        <w:pPr>
-                          <w:spacing w:before="0" w:after="160" w:line="259" w:lineRule="auto"/>
+                <v:rect id="Rectangle 10" o:spid="_x0000_s1031" style="position:absolute;left:927;top:30236;width:22503;height:1720;visibility:visible;mso-wrap-style:square;v-text-anchor:top" o:gfxdata="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" filled="f" stroked="f">
+                  <v:textbox inset="0,0,0,0">
+                    <w:txbxContent>
+                      <w:p>
+                        <w:pPr>
+                          <w:spacing w:after="160" w:line="259" w:lineRule="auto"/>
                           <w:ind w:left="0" w:firstLine="0"/>
                         </w:pPr>
                         <w:r>
@@ -4258,48 +4076,48 @@
                     </w:txbxContent>
                   </v:textbox>
                 </v:rect>
-                <v:rect id="Rectangle 11" style="position:absolute;width:2771;height:1720;left:927;top:31791;" filled="f" stroked="f">
-                  <v:textbox inset="0,0,0,0">
-                    <w:txbxContent>
-                      <w:p>
-                        <w:pPr>
-                          <w:spacing w:before="0" w:after="160" w:line="259" w:lineRule="auto"/>
-                          <w:ind w:left="0" w:firstLine="0"/>
-                        </w:pPr>
-                        <w:r>
-                          <w:rPr>
-                            <w:sz w:val="20"/>
-                          </w:rPr>
-                          <w:t xml:space="preserve">Arts</w:t>
-                        </w:r>
-                      </w:p>
-                    </w:txbxContent>
-                  </v:textbox>
-                </v:rect>
-                <v:rect id="Rectangle 12" style="position:absolute;width:425;height:1720;left:3025;top:31791;" filled="f" stroked="f">
-                  <v:textbox inset="0,0,0,0">
-                    <w:txbxContent>
-                      <w:p>
-                        <w:pPr>
-                          <w:spacing w:before="0" w:after="160" w:line="259" w:lineRule="auto"/>
-                          <w:ind w:left="0" w:firstLine="0"/>
-                        </w:pPr>
-                        <w:r>
-                          <w:rPr>
-                            <w:sz w:val="20"/>
-                          </w:rPr>
-                          <w:t xml:space="preserve">.</w:t>
-                        </w:r>
-                      </w:p>
-                    </w:txbxContent>
-                  </v:textbox>
-                </v:rect>
-                <v:rect id="Rectangle 13" style="position:absolute;width:381;height:1720;left:3343;top:31791;" filled="f" stroked="f">
-                  <v:textbox inset="0,0,0,0">
-                    <w:txbxContent>
-                      <w:p>
-                        <w:pPr>
-                          <w:spacing w:before="0" w:after="160" w:line="259" w:lineRule="auto"/>
+                <v:rect id="Rectangle 11" o:spid="_x0000_s1032" style="position:absolute;left:927;top:31791;width:2771;height:1721;visibility:visible;mso-wrap-style:square;v-text-anchor:top" o:gfxdata="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" filled="f" stroked="f">
+                  <v:textbox inset="0,0,0,0">
+                    <w:txbxContent>
+                      <w:p>
+                        <w:pPr>
+                          <w:spacing w:after="160" w:line="259" w:lineRule="auto"/>
+                          <w:ind w:left="0" w:firstLine="0"/>
+                        </w:pPr>
+                        <w:r>
+                          <w:rPr>
+                            <w:sz w:val="20"/>
+                          </w:rPr>
+                          <w:t>Arts</w:t>
+                        </w:r>
+                      </w:p>
+                    </w:txbxContent>
+                  </v:textbox>
+                </v:rect>
+                <v:rect id="Rectangle 12" o:spid="_x0000_s1033" style="position:absolute;left:3025;top:31791;width:426;height:1721;visibility:visible;mso-wrap-style:square;v-text-anchor:top" o:gfxdata="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" filled="f" stroked="f">
+                  <v:textbox inset="0,0,0,0">
+                    <w:txbxContent>
+                      <w:p>
+                        <w:pPr>
+                          <w:spacing w:after="160" w:line="259" w:lineRule="auto"/>
+                          <w:ind w:left="0" w:firstLine="0"/>
+                        </w:pPr>
+                        <w:r>
+                          <w:rPr>
+                            <w:sz w:val="20"/>
+                          </w:rPr>
+                          <w:t>.</w:t>
+                        </w:r>
+                      </w:p>
+                    </w:txbxContent>
+                  </v:textbox>
+                </v:rect>
+                <v:rect id="Rectangle 13" o:spid="_x0000_s1034" style="position:absolute;left:3343;top:31791;width:382;height:1721;visibility:visible;mso-wrap-style:square;v-text-anchor:top" o:gfxdata="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" filled="f" stroked="f">
+                  <v:textbox inset="0,0,0,0">
+                    <w:txbxContent>
+                      <w:p>
+                        <w:pPr>
+                          <w:spacing w:after="160" w:line="259" w:lineRule="auto"/>
                           <w:ind w:left="0" w:firstLine="0"/>
                         </w:pPr>
                         <w:r>
@@ -4312,12 +4130,12 @@
                     </w:txbxContent>
                   </v:textbox>
                 </v:rect>
-                <v:rect id="Rectangle 14" style="position:absolute;width:25160;height:1720;left:927;top:33347;" filled="f" stroked="f">
-                  <v:textbox inset="0,0,0,0">
-                    <w:txbxContent>
-                      <w:p>
-                        <w:pPr>
-                          <w:spacing w:before="0" w:after="160" w:line="259" w:lineRule="auto"/>
+                <v:rect id="Rectangle 14" o:spid="_x0000_s1035" style="position:absolute;left:927;top:33347;width:25160;height:1721;visibility:visible;mso-wrap-style:square;v-text-anchor:top" o:gfxdata="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" filled="f" stroked="f">
+                  <v:textbox inset="0,0,0,0">
+                    <w:txbxContent>
+                      <w:p>
+                        <w:pPr>
+                          <w:spacing w:after="160" w:line="259" w:lineRule="auto"/>
                           <w:ind w:left="0" w:firstLine="0"/>
                         </w:pPr>
                         <w:r>
@@ -4330,30 +4148,30 @@
                     </w:txbxContent>
                   </v:textbox>
                 </v:rect>
-                <v:rect id="Rectangle 15" style="position:absolute;width:3359;height:1720;left:927;top:34902;" filled="f" stroked="f">
-                  <v:textbox inset="0,0,0,0">
-                    <w:txbxContent>
-                      <w:p>
-                        <w:pPr>
-                          <w:spacing w:before="0" w:after="160" w:line="259" w:lineRule="auto"/>
-                          <w:ind w:left="0" w:firstLine="0"/>
-                        </w:pPr>
-                        <w:r>
-                          <w:rPr>
-                            <w:sz w:val="20"/>
-                          </w:rPr>
-                          <w:t xml:space="preserve">roles</w:t>
-                        </w:r>
-                      </w:p>
-                    </w:txbxContent>
-                  </v:textbox>
-                </v:rect>
-                <v:rect id="Rectangle 16" style="position:absolute;width:381;height:1720;left:3470;top:34902;" filled="f" stroked="f">
-                  <v:textbox inset="0,0,0,0">
-                    <w:txbxContent>
-                      <w:p>
-                        <w:pPr>
-                          <w:spacing w:before="0" w:after="160" w:line="259" w:lineRule="auto"/>
+                <v:rect id="Rectangle 15" o:spid="_x0000_s1036" style="position:absolute;left:927;top:34902;width:3359;height:1720;visibility:visible;mso-wrap-style:square;v-text-anchor:top" o:gfxdata="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" filled="f" stroked="f">
+                  <v:textbox inset="0,0,0,0">
+                    <w:txbxContent>
+                      <w:p>
+                        <w:pPr>
+                          <w:spacing w:after="160" w:line="259" w:lineRule="auto"/>
+                          <w:ind w:left="0" w:firstLine="0"/>
+                        </w:pPr>
+                        <w:r>
+                          <w:rPr>
+                            <w:sz w:val="20"/>
+                          </w:rPr>
+                          <w:t>roles</w:t>
+                        </w:r>
+                      </w:p>
+                    </w:txbxContent>
+                  </v:textbox>
+                </v:rect>
+                <v:rect id="Rectangle 16" o:spid="_x0000_s1037" style="position:absolute;left:3470;top:34902;width:382;height:1720;visibility:visible;mso-wrap-style:square;v-text-anchor:top" o:gfxdata="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" filled="f" stroked="f">
+                  <v:textbox inset="0,0,0,0">
+                    <w:txbxContent>
+                      <w:p>
+                        <w:pPr>
+                          <w:spacing w:after="160" w:line="259" w:lineRule="auto"/>
                           <w:ind w:left="0" w:firstLine="0"/>
                         </w:pPr>
                         <w:r>
@@ -4366,12 +4184,12 @@
                     </w:txbxContent>
                   </v:textbox>
                 </v:rect>
-                <v:rect id="Rectangle 17" style="position:absolute;width:15536;height:1720;left:3756;top:34902;" filled="f" stroked="f">
-                  <v:textbox inset="0,0,0,0">
-                    <w:txbxContent>
-                      <w:p>
-                        <w:pPr>
-                          <w:spacing w:before="0" w:after="160" w:line="259" w:lineRule="auto"/>
+                <v:rect id="Rectangle 17" o:spid="_x0000_s1038" style="position:absolute;left:3756;top:34902;width:15536;height:1720;visibility:visible;mso-wrap-style:square;v-text-anchor:top" o:gfxdata="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" filled="f" stroked="f">
+                  <v:textbox inset="0,0,0,0">
+                    <w:txbxContent>
+                      <w:p>
+                        <w:pPr>
+                          <w:spacing w:after="160" w:line="259" w:lineRule="auto"/>
                           <w:ind w:left="0" w:firstLine="0"/>
                         </w:pPr>
                         <w:r>
@@ -4384,12 +4202,12 @@
                     </w:txbxContent>
                   </v:textbox>
                 </v:rect>
-                <v:rect id="Rectangle 18" style="position:absolute;width:3842;height:1720;left:15443;top:34902;" filled="f" stroked="f">
-                  <v:textbox inset="0,0,0,0">
-                    <w:txbxContent>
-                      <w:p>
-                        <w:pPr>
-                          <w:spacing w:before="0" w:after="160" w:line="259" w:lineRule="auto"/>
+                <v:rect id="Rectangle 18" o:spid="_x0000_s1039" style="position:absolute;left:15443;top:34902;width:3842;height:1720;visibility:visible;mso-wrap-style:square;v-text-anchor:top" o:gfxdata="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" filled="f" stroked="f">
+                  <v:textbox inset="0,0,0,0">
+                    <w:txbxContent>
+                      <w:p>
+                        <w:pPr>
+                          <w:spacing w:after="160" w:line="259" w:lineRule="auto"/>
                           <w:ind w:left="0" w:firstLine="0"/>
                         </w:pPr>
                         <w:r>
@@ -4402,12 +4220,12 @@
                     </w:txbxContent>
                   </v:textbox>
                 </v:rect>
-                <v:rect id="Rectangle 19" style="position:absolute;width:6796;height:1720;left:927;top:36459;" filled="f" stroked="f">
-                  <v:textbox inset="0,0,0,0">
-                    <w:txbxContent>
-                      <w:p>
-                        <w:pPr>
-                          <w:spacing w:before="0" w:after="160" w:line="259" w:lineRule="auto"/>
+                <v:rect id="Rectangle 19" o:spid="_x0000_s1040" style="position:absolute;left:927;top:36459;width:6797;height:1720;visibility:visible;mso-wrap-style:square;v-text-anchor:top" o:gfxdata="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" filled="f" stroked="f">
+                  <v:textbox inset="0,0,0,0">
+                    <w:txbxContent>
+                      <w:p>
+                        <w:pPr>
+                          <w:spacing w:after="160" w:line="259" w:lineRule="auto"/>
                           <w:ind w:left="0" w:firstLine="0"/>
                         </w:pPr>
                         <w:r>
@@ -4420,12 +4238,12 @@
                     </w:txbxContent>
                   </v:textbox>
                 </v:rect>
-                <v:rect id="Rectangle 20" style="position:absolute;width:381;height:1720;left:6010;top:36459;" filled="f" stroked="f">
-                  <v:textbox inset="0,0,0,0">
-                    <w:txbxContent>
-                      <w:p>
-                        <w:pPr>
-                          <w:spacing w:before="0" w:after="160" w:line="259" w:lineRule="auto"/>
+                <v:rect id="Rectangle 20" o:spid="_x0000_s1041" style="position:absolute;left:6010;top:36459;width:382;height:1720;visibility:visible;mso-wrap-style:square;v-text-anchor:top" o:gfxdata="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" filled="f" stroked="f">
+                  <v:textbox inset="0,0,0,0">
+                    <w:txbxContent>
+                      <w:p>
+                        <w:pPr>
+                          <w:spacing w:after="160" w:line="259" w:lineRule="auto"/>
                           <w:ind w:left="0" w:firstLine="0"/>
                         </w:pPr>
                         <w:r>
@@ -4438,12 +4256,12 @@
                     </w:txbxContent>
                   </v:textbox>
                 </v:rect>
-                <v:rect id="Rectangle 21" style="position:absolute;width:22117;height:1720;left:927;top:38017;" filled="f" stroked="f">
-                  <v:textbox inset="0,0,0,0">
-                    <w:txbxContent>
-                      <w:p>
-                        <w:pPr>
-                          <w:spacing w:before="0" w:after="160" w:line="259" w:lineRule="auto"/>
+                <v:rect id="Rectangle 21" o:spid="_x0000_s1042" style="position:absolute;left:927;top:38017;width:22117;height:1720;visibility:visible;mso-wrap-style:square;v-text-anchor:top" o:gfxdata="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" filled="f" stroked="f">
+                  <v:textbox inset="0,0,0,0">
+                    <w:txbxContent>
+                      <w:p>
+                        <w:pPr>
+                          <w:spacing w:after="160" w:line="259" w:lineRule="auto"/>
                           <w:ind w:left="0" w:firstLine="0"/>
                         </w:pPr>
                         <w:r>
@@ -4456,30 +4274,30 @@
                     </w:txbxContent>
                   </v:textbox>
                 </v:rect>
-                <v:rect id="Rectangle 22" style="position:absolute;width:13803;height:1720;left:927;top:39541;" filled="f" stroked="f">
-                  <v:textbox inset="0,0,0,0">
-                    <w:txbxContent>
-                      <w:p>
-                        <w:pPr>
-                          <w:spacing w:before="0" w:after="160" w:line="259" w:lineRule="auto"/>
-                          <w:ind w:left="0" w:firstLine="0"/>
-                        </w:pPr>
-                        <w:r>
-                          <w:rPr>
-                            <w:sz w:val="20"/>
-                          </w:rPr>
-                          <w:t xml:space="preserve">organizational skills.</w:t>
-                        </w:r>
-                      </w:p>
-                    </w:txbxContent>
-                  </v:textbox>
-                </v:rect>
-                <v:rect id="Rectangle 23" style="position:absolute;width:381;height:1720;left:11315;top:39541;" filled="f" stroked="f">
-                  <v:textbox inset="0,0,0,0">
-                    <w:txbxContent>
-                      <w:p>
-                        <w:pPr>
-                          <w:spacing w:before="0" w:after="160" w:line="259" w:lineRule="auto"/>
+                <v:rect id="Rectangle 22" o:spid="_x0000_s1043" style="position:absolute;left:927;top:39541;width:13803;height:1720;visibility:visible;mso-wrap-style:square;v-text-anchor:top" o:gfxdata="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" filled="f" stroked="f">
+                  <v:textbox inset="0,0,0,0">
+                    <w:txbxContent>
+                      <w:p>
+                        <w:pPr>
+                          <w:spacing w:after="160" w:line="259" w:lineRule="auto"/>
+                          <w:ind w:left="0" w:firstLine="0"/>
+                        </w:pPr>
+                        <w:r>
+                          <w:rPr>
+                            <w:sz w:val="20"/>
+                          </w:rPr>
+                          <w:t>organizational skills.</w:t>
+                        </w:r>
+                      </w:p>
+                    </w:txbxContent>
+                  </v:textbox>
+                </v:rect>
+                <v:rect id="Rectangle 23" o:spid="_x0000_s1044" style="position:absolute;left:11315;top:39541;width:382;height:1720;visibility:visible;mso-wrap-style:square;v-text-anchor:top" o:gfxdata="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" filled="f" stroked="f">
+                  <v:textbox inset="0,0,0,0">
+                    <w:txbxContent>
+                      <w:p>
+                        <w:pPr>
+                          <w:spacing w:after="160" w:line="259" w:lineRule="auto"/>
                           <w:ind w:left="0" w:firstLine="0"/>
                         </w:pPr>
                         <w:r>
@@ -4492,12 +4310,12 @@
                     </w:txbxContent>
                   </v:textbox>
                 </v:rect>
-                <v:rect id="Rectangle 24" style="position:absolute;width:381;height:1720;left:927;top:41097;" filled="f" stroked="f">
-                  <v:textbox inset="0,0,0,0">
-                    <w:txbxContent>
-                      <w:p>
-                        <w:pPr>
-                          <w:spacing w:before="0" w:after="160" w:line="259" w:lineRule="auto"/>
+                <v:rect id="Rectangle 24" o:spid="_x0000_s1045" style="position:absolute;left:927;top:41097;width:381;height:1720;visibility:visible;mso-wrap-style:square;v-text-anchor:top" o:gfxdata="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" filled="f" stroked="f">
+                  <v:textbox inset="0,0,0,0">
+                    <w:txbxContent>
+                      <w:p>
+                        <w:pPr>
+                          <w:spacing w:after="160" w:line="259" w:lineRule="auto"/>
                           <w:ind w:left="0" w:firstLine="0"/>
                         </w:pPr>
                         <w:r>
@@ -4510,12 +4328,12 @@
                     </w:txbxContent>
                   </v:textbox>
                 </v:rect>
-                <v:rect id="Rectangle 25" style="position:absolute;width:381;height:1720;left:1216;top:41097;" filled="f" stroked="f">
-                  <v:textbox inset="0,0,0,0">
-                    <w:txbxContent>
-                      <w:p>
-                        <w:pPr>
-                          <w:spacing w:before="0" w:after="160" w:line="259" w:lineRule="auto"/>
+                <v:rect id="Rectangle 25" o:spid="_x0000_s1046" style="position:absolute;left:1216;top:41097;width:381;height:1720;visibility:visible;mso-wrap-style:square;v-text-anchor:top" o:gfxdata="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" filled="f" stroked="f">
+                  <v:textbox inset="0,0,0,0">
+                    <w:txbxContent>
+                      <w:p>
+                        <w:pPr>
+                          <w:spacing w:after="160" w:line="259" w:lineRule="auto"/>
                           <w:ind w:left="0" w:firstLine="0"/>
                         </w:pPr>
                         <w:r>
@@ -4528,12 +4346,12 @@
                     </w:txbxContent>
                   </v:textbox>
                 </v:rect>
-                <v:rect id="Rectangle 26" style="position:absolute;width:381;height:1720;left:927;top:42652;" filled="f" stroked="f">
-                  <v:textbox inset="0,0,0,0">
-                    <w:txbxContent>
-                      <w:p>
-                        <w:pPr>
-                          <w:spacing w:before="0" w:after="160" w:line="259" w:lineRule="auto"/>
+                <v:rect id="Rectangle 26" o:spid="_x0000_s1047" style="position:absolute;left:927;top:42652;width:381;height:1721;visibility:visible;mso-wrap-style:square;v-text-anchor:top" o:gfxdata="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" filled="f" stroked="f">
+                  <v:textbox inset="0,0,0,0">
+                    <w:txbxContent>
+                      <w:p>
+                        <w:pPr>
+                          <w:spacing w:after="160" w:line="259" w:lineRule="auto"/>
                           <w:ind w:left="0" w:firstLine="0"/>
                         </w:pPr>
                         <w:r>
@@ -4546,38 +4364,36 @@
                     </w:txbxContent>
                   </v:textbox>
                 </v:rect>
-                <v:rect id="Rectangle 27" style="position:absolute;width:6181;height:2408;left:927;top:44303;" filled="f" stroked="f">
-                  <v:textbox inset="0,0,0,0">
-                    <w:txbxContent>
-                      <w:p>
-                        <w:pPr>
-                          <w:spacing w:before="0" w:after="160" w:line="259" w:lineRule="auto"/>
-                          <w:ind w:left="0" w:firstLine="0"/>
-                        </w:pPr>
-                        <w:r>
-                          <w:rPr>
-                            <w:rFonts w:cs="Calibri" w:hAnsi="Calibri" w:eastAsia="Calibri" w:ascii="Calibri"/>
-                            <w:b w:val="1"/>
+                <v:rect id="Rectangle 27" o:spid="_x0000_s1048" style="position:absolute;left:927;top:44303;width:6181;height:2409;visibility:visible;mso-wrap-style:square;v-text-anchor:top" o:gfxdata="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" filled="f" stroked="f">
+                  <v:textbox inset="0,0,0,0">
+                    <w:txbxContent>
+                      <w:p>
+                        <w:pPr>
+                          <w:spacing w:after="160" w:line="259" w:lineRule="auto"/>
+                          <w:ind w:left="0" w:firstLine="0"/>
+                        </w:pPr>
+                        <w:r>
+                          <w:rPr>
+                            <w:b/>
                             <w:sz w:val="28"/>
                           </w:rPr>
-                          <w:t xml:space="preserve">SKILLS</w:t>
-                        </w:r>
-                      </w:p>
-                    </w:txbxContent>
-                  </v:textbox>
-                </v:rect>
-                <v:rect id="Rectangle 28" style="position:absolute;width:534;height:2408;left:5565;top:44303;" filled="f" stroked="f">
-                  <v:textbox inset="0,0,0,0">
-                    <w:txbxContent>
-                      <w:p>
-                        <w:pPr>
-                          <w:spacing w:before="0" w:after="160" w:line="259" w:lineRule="auto"/>
-                          <w:ind w:left="0" w:firstLine="0"/>
-                        </w:pPr>
-                        <w:r>
-                          <w:rPr>
-                            <w:rFonts w:cs="Calibri" w:hAnsi="Calibri" w:eastAsia="Calibri" w:ascii="Calibri"/>
-                            <w:b w:val="1"/>
+                          <w:t>SKILLS</w:t>
+                        </w:r>
+                      </w:p>
+                    </w:txbxContent>
+                  </v:textbox>
+                </v:rect>
+                <v:rect id="Rectangle 28" o:spid="_x0000_s1049" style="position:absolute;left:5565;top:44303;width:535;height:2409;visibility:visible;mso-wrap-style:square;v-text-anchor:top" o:gfxdata="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" filled="f" stroked="f">
+                  <v:textbox inset="0,0,0,0">
+                    <w:txbxContent>
+                      <w:p>
+                        <w:pPr>
+                          <w:spacing w:after="160" w:line="259" w:lineRule="auto"/>
+                          <w:ind w:left="0" w:firstLine="0"/>
+                        </w:pPr>
+                        <w:r>
+                          <w:rPr>
+                            <w:b/>
                             <w:sz w:val="28"/>
                           </w:rPr>
                           <w:t xml:space="preserve"> </w:t>
@@ -4586,18 +4402,17 @@
                     </w:txbxContent>
                   </v:textbox>
                 </v:rect>
-                <v:rect id="Rectangle 29" style="position:absolute;width:534;height:2408;left:927;top:46462;" filled="f" stroked="f">
-                  <v:textbox inset="0,0,0,0">
-                    <w:txbxContent>
-                      <w:p>
-                        <w:pPr>
-                          <w:spacing w:before="0" w:after="160" w:line="259" w:lineRule="auto"/>
-                          <w:ind w:left="0" w:firstLine="0"/>
-                        </w:pPr>
-                        <w:r>
-                          <w:rPr>
-                            <w:rFonts w:cs="Calibri" w:hAnsi="Calibri" w:eastAsia="Calibri" w:ascii="Calibri"/>
-                            <w:b w:val="1"/>
+                <v:rect id="Rectangle 29" o:spid="_x0000_s1050" style="position:absolute;left:927;top:46462;width:534;height:2409;visibility:visible;mso-wrap-style:square;v-text-anchor:top" o:gfxdata="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" filled="f" stroked="f">
+                  <v:textbox inset="0,0,0,0">
+                    <w:txbxContent>
+                      <w:p>
+                        <w:pPr>
+                          <w:spacing w:after="160" w:line="259" w:lineRule="auto"/>
+                          <w:ind w:left="0" w:firstLine="0"/>
+                        </w:pPr>
+                        <w:r>
+                          <w:rPr>
+                            <w:b/>
                             <w:sz w:val="28"/>
                           </w:rPr>
                           <w:t xml:space="preserve"> </w:t>
@@ -4606,30 +4421,30 @@
                     </w:txbxContent>
                   </v:textbox>
                 </v:rect>
-                <v:rect id="Rectangle 30" style="position:absolute;width:516;height:1720;left:927;top:48560;" filled="f" stroked="f">
-                  <v:textbox inset="0,0,0,0">
-                    <w:txbxContent>
-                      <w:p>
-                        <w:pPr>
-                          <w:spacing w:before="0" w:after="160" w:line="259" w:lineRule="auto"/>
-                          <w:ind w:left="0" w:firstLine="0"/>
-                        </w:pPr>
-                        <w:r>
-                          <w:rPr>
-                            <w:sz w:val="20"/>
-                          </w:rPr>
-                          <w:t xml:space="preserve">-</w:t>
-                        </w:r>
-                      </w:p>
-                    </w:txbxContent>
-                  </v:textbox>
-                </v:rect>
-                <v:rect id="Rectangle 31" style="position:absolute;width:381;height:1720;left:1311;top:48560;" filled="f" stroked="f">
-                  <v:textbox inset="0,0,0,0">
-                    <w:txbxContent>
-                      <w:p>
-                        <w:pPr>
-                          <w:spacing w:before="0" w:after="160" w:line="259" w:lineRule="auto"/>
+                <v:rect id="Rectangle 30" o:spid="_x0000_s1051" style="position:absolute;left:927;top:48560;width:516;height:1721;visibility:visible;mso-wrap-style:square;v-text-anchor:top" o:gfxdata="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" filled="f" stroked="f">
+                  <v:textbox inset="0,0,0,0">
+                    <w:txbxContent>
+                      <w:p>
+                        <w:pPr>
+                          <w:spacing w:after="160" w:line="259" w:lineRule="auto"/>
+                          <w:ind w:left="0" w:firstLine="0"/>
+                        </w:pPr>
+                        <w:r>
+                          <w:rPr>
+                            <w:sz w:val="20"/>
+                          </w:rPr>
+                          <w:t>-</w:t>
+                        </w:r>
+                      </w:p>
+                    </w:txbxContent>
+                  </v:textbox>
+                </v:rect>
+                <v:rect id="Rectangle 31" o:spid="_x0000_s1052" style="position:absolute;left:1311;top:48560;width:382;height:1721;visibility:visible;mso-wrap-style:square;v-text-anchor:top" o:gfxdata="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" filled="f" stroked="f">
+                  <v:textbox inset="0,0,0,0">
+                    <w:txbxContent>
+                      <w:p>
+                        <w:pPr>
+                          <w:spacing w:after="160" w:line="259" w:lineRule="auto"/>
                           <w:ind w:left="0" w:firstLine="0"/>
                         </w:pPr>
                         <w:r>
@@ -4642,66 +4457,54 @@
                     </w:txbxContent>
                   </v:textbox>
                 </v:rect>
-                <v:rect id="Rectangle 32" style="position:absolute;width:10046;height:1720;left:1597;top:48560;" filled="f" stroked="f">
-                  <v:textbox inset="0,0,0,0">
-                    <w:txbxContent>
-                      <w:p>
-                        <w:pPr>
-                          <w:spacing w:before="0" w:after="160" w:line="259" w:lineRule="auto"/>
-                          <w:ind w:left="0" w:firstLine="0"/>
-                        </w:pPr>
-                        <w:r>
-                          <w:rPr>
-                            <w:sz w:val="20"/>
-                          </w:rPr>
-                          <w:t xml:space="preserve">Vibe coding in </w:t>
-                        </w:r>
-                      </w:p>
-                    </w:txbxContent>
-                  </v:textbox>
-                </v:rect>
-                <v:rect id="Rectangle 33" style="position:absolute;width:900;height:1720;left:9156;top:48560;" filled="f" stroked="f">
-                  <v:textbox inset="0,0,0,0">
-                    <w:txbxContent>
-                      <w:p>
-                        <w:pPr>
-                          <w:spacing w:before="0" w:after="160" w:line="259" w:lineRule="auto"/>
-                          <w:ind w:left="0" w:firstLine="0"/>
-                        </w:pPr>
-                        <w:r>
-                          <w:rPr>
-                            <w:sz w:val="20"/>
-                          </w:rPr>
-                          <w:t xml:space="preserve">C</w:t>
-                        </w:r>
-                      </w:p>
-                    </w:txbxContent>
-                  </v:textbox>
-                </v:rect>
-                <v:rect id="Rectangle 34" style="position:absolute;width:3631;height:1720;left:9823;top:48560;" filled="f" stroked="f">
-                  <v:textbox inset="0,0,0,0">
-                    <w:txbxContent>
-                      <w:p>
-                        <w:pPr>
-                          <w:spacing w:before="0" w:after="160" w:line="259" w:lineRule="auto"/>
-                          <w:ind w:left="0" w:firstLine="0"/>
-                        </w:pPr>
-                        <w:r>
-                          <w:rPr>
-                            <w:sz w:val="20"/>
-                          </w:rPr>
-                          <w:t xml:space="preserve">ursor</w:t>
-                        </w:r>
-                      </w:p>
-                    </w:txbxContent>
-                  </v:textbox>
-                </v:rect>
-                <v:rect id="Rectangle 35" style="position:absolute;width:381;height:1720;left:12553;top:48560;" filled="f" stroked="f">
-                  <v:textbox inset="0,0,0,0">
-                    <w:txbxContent>
-                      <w:p>
-                        <w:pPr>
-                          <w:spacing w:before="0" w:after="160" w:line="259" w:lineRule="auto"/>
+                <v:rect id="Rectangle 32" o:spid="_x0000_s1053" style="position:absolute;left:1597;top:48560;width:20582;height:1721;visibility:visible;mso-wrap-style:square;v-text-anchor:top" o:gfxdata="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" filled="f" stroked="f">
+                  <v:textbox inset="0,0,0,0">
+                    <w:txbxContent>
+                      <w:p>
+                        <w:pPr>
+                          <w:spacing w:after="160" w:line="259" w:lineRule="auto"/>
+                          <w:ind w:left="0" w:firstLine="0"/>
+                          <w:rPr>
+                            <w:sz w:val="20"/>
+                            <w:szCs w:val="20"/>
+                          </w:rPr>
+                        </w:pPr>
+                        <w:r>
+                          <w:rPr>
+                            <w:sz w:val="20"/>
+                            <w:szCs w:val="20"/>
+                          </w:rPr>
+                          <w:t>Full control in</w:t>
+                        </w:r>
+                        <w:r>
+                          <w:rPr>
+                            <w:sz w:val="20"/>
+                            <w:szCs w:val="20"/>
+                          </w:rPr>
+                          <w:t xml:space="preserve"> Comfy UI</w:t>
+                        </w:r>
+                      </w:p>
+                    </w:txbxContent>
+                  </v:textbox>
+                </v:rect>
+                <v:rect id="Rectangle 33" o:spid="_x0000_s1054" style="position:absolute;left:11569;top:48558;width:6005;height:1720;visibility:visible;mso-wrap-style:square;v-text-anchor:top" o:gfxdata="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" filled="f" stroked="f">
+                  <v:textbox inset="0,0,0,0">
+                    <w:txbxContent>
+                      <w:p>
+                        <w:pPr>
+                          <w:spacing w:after="160" w:line="259" w:lineRule="auto"/>
+                          <w:ind w:left="0" w:firstLine="0"/>
+                        </w:pPr>
+                      </w:p>
+                    </w:txbxContent>
+                  </v:textbox>
+                </v:rect>
+                <v:rect id="Rectangle 35" o:spid="_x0000_s1055" style="position:absolute;left:12553;top:48560;width:382;height:1721;visibility:visible;mso-wrap-style:square;v-text-anchor:top" o:gfxdata="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" filled="f" stroked="f">
+                  <v:textbox inset="0,0,0,0">
+                    <w:txbxContent>
+                      <w:p>
+                        <w:pPr>
+                          <w:spacing w:after="160" w:line="259" w:lineRule="auto"/>
                           <w:ind w:left="0" w:firstLine="0"/>
                         </w:pPr>
                         <w:r>
@@ -4714,12 +4517,12 @@
                     </w:txbxContent>
                   </v:textbox>
                 </v:rect>
-                <v:rect id="Rectangle 36" style="position:absolute;width:381;height:1720;left:12839;top:48560;" filled="f" stroked="f">
-                  <v:textbox inset="0,0,0,0">
-                    <w:txbxContent>
-                      <w:p>
-                        <w:pPr>
-                          <w:spacing w:before="0" w:after="160" w:line="259" w:lineRule="auto"/>
+                <v:rect id="Rectangle 36" o:spid="_x0000_s1056" style="position:absolute;left:12839;top:48560;width:382;height:1721;visibility:visible;mso-wrap-style:square;v-text-anchor:top" o:gfxdata="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" filled="f" stroked="f">
+                  <v:textbox inset="0,0,0,0">
+                    <w:txbxContent>
+                      <w:p>
+                        <w:pPr>
+                          <w:spacing w:after="160" w:line="259" w:lineRule="auto"/>
                           <w:ind w:left="0" w:firstLine="0"/>
                         </w:pPr>
                         <w:r>
@@ -4732,31 +4535,31 @@
                     </w:txbxContent>
                   </v:textbox>
                 </v:rect>
-                <v:rect id="Rectangle 37" style="position:absolute;width:562;height:1587;left:927;top:50906;" filled="f" stroked="f">
-                  <v:textbox inset="0,0,0,0">
-                    <w:txbxContent>
-                      <w:p>
-                        <w:pPr>
-                          <w:spacing w:before="0" w:after="160" w:line="259" w:lineRule="auto"/>
-                          <w:ind w:left="0" w:firstLine="0"/>
-                        </w:pPr>
-                        <w:r>
-                          <w:rPr>
-                            <w:rFonts w:cs="Arial" w:hAnsi="Arial" w:eastAsia="Arial" w:ascii="Arial"/>
-                            <w:sz w:val="20"/>
-                          </w:rPr>
-                          <w:t xml:space="preserve">-</w:t>
-                        </w:r>
-                      </w:p>
-                    </w:txbxContent>
-                  </v:textbox>
-                </v:rect>
-                <v:rect id="Rectangle 38" style="position:absolute;width:381;height:1720;left:1343;top:50878;" filled="f" stroked="f">
-                  <v:textbox inset="0,0,0,0">
-                    <w:txbxContent>
-                      <w:p>
-                        <w:pPr>
-                          <w:spacing w:before="0" w:after="160" w:line="259" w:lineRule="auto"/>
+                <v:rect id="Rectangle 37" o:spid="_x0000_s1057" style="position:absolute;left:927;top:50906;width:562;height:1588;visibility:visible;mso-wrap-style:square;v-text-anchor:top" o:gfxdata="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" filled="f" stroked="f">
+                  <v:textbox inset="0,0,0,0">
+                    <w:txbxContent>
+                      <w:p>
+                        <w:pPr>
+                          <w:spacing w:after="160" w:line="259" w:lineRule="auto"/>
+                          <w:ind w:left="0" w:firstLine="0"/>
+                        </w:pPr>
+                        <w:r>
+                          <w:rPr>
+                            <w:rFonts w:ascii="Arial" w:eastAsia="Arial" w:hAnsi="Arial" w:cs="Arial"/>
+                            <w:sz w:val="20"/>
+                          </w:rPr>
+                          <w:t>-</w:t>
+                        </w:r>
+                      </w:p>
+                    </w:txbxContent>
+                  </v:textbox>
+                </v:rect>
+                <v:rect id="Rectangle 38" o:spid="_x0000_s1058" style="position:absolute;left:1343;top:50878;width:381;height:1721;visibility:visible;mso-wrap-style:square;v-text-anchor:top" o:gfxdata="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" filled="f" stroked="f">
+                  <v:textbox inset="0,0,0,0">
+                    <w:txbxContent>
+                      <w:p>
+                        <w:pPr>
+                          <w:spacing w:after="160" w:line="259" w:lineRule="auto"/>
                           <w:ind w:left="0" w:firstLine="0"/>
                         </w:pPr>
                         <w:r>
@@ -4769,48 +4572,48 @@
                     </w:txbxContent>
                   </v:textbox>
                 </v:rect>
-                <v:rect id="Rectangle 39" style="position:absolute;width:17762;height:1720;left:1628;top:50878;" filled="f" stroked="f">
-                  <v:textbox inset="0,0,0,0">
-                    <w:txbxContent>
-                      <w:p>
-                        <w:pPr>
-                          <w:spacing w:before="0" w:after="160" w:line="259" w:lineRule="auto"/>
-                          <w:ind w:left="0" w:firstLine="0"/>
-                        </w:pPr>
-                        <w:r>
-                          <w:rPr>
-                            <w:sz w:val="20"/>
-                          </w:rPr>
-                          <w:t xml:space="preserve">Adobe Programs: Premier</w:t>
-                        </w:r>
-                      </w:p>
-                    </w:txbxContent>
-                  </v:textbox>
-                </v:rect>
-                <v:rect id="Rectangle 40" style="position:absolute;width:841;height:1720;left:14998;top:50878;" filled="f" stroked="f">
-                  <v:textbox inset="0,0,0,0">
-                    <w:txbxContent>
-                      <w:p>
-                        <w:pPr>
-                          <w:spacing w:before="0" w:after="160" w:line="259" w:lineRule="auto"/>
-                          <w:ind w:left="0" w:firstLine="0"/>
-                        </w:pPr>
-                        <w:r>
-                          <w:rPr>
-                            <w:sz w:val="20"/>
-                          </w:rPr>
-                          <w:t xml:space="preserve">e</w:t>
-                        </w:r>
-                      </w:p>
-                    </w:txbxContent>
-                  </v:textbox>
-                </v:rect>
-                <v:rect id="Rectangle 41" style="position:absolute;width:381;height:1720;left:15633;top:50878;" filled="f" stroked="f">
-                  <v:textbox inset="0,0,0,0">
-                    <w:txbxContent>
-                      <w:p>
-                        <w:pPr>
-                          <w:spacing w:before="0" w:after="160" w:line="259" w:lineRule="auto"/>
+                <v:rect id="Rectangle 39" o:spid="_x0000_s1059" style="position:absolute;left:1628;top:50878;width:17763;height:1721;visibility:visible;mso-wrap-style:square;v-text-anchor:top" o:gfxdata="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" filled="f" stroked="f">
+                  <v:textbox inset="0,0,0,0">
+                    <w:txbxContent>
+                      <w:p>
+                        <w:pPr>
+                          <w:spacing w:after="160" w:line="259" w:lineRule="auto"/>
+                          <w:ind w:left="0" w:firstLine="0"/>
+                        </w:pPr>
+                        <w:r>
+                          <w:rPr>
+                            <w:sz w:val="20"/>
+                          </w:rPr>
+                          <w:t>Adobe Programs: Premier</w:t>
+                        </w:r>
+                      </w:p>
+                    </w:txbxContent>
+                  </v:textbox>
+                </v:rect>
+                <v:rect id="Rectangle 40" o:spid="_x0000_s1060" style="position:absolute;left:14998;top:50878;width:841;height:1721;visibility:visible;mso-wrap-style:square;v-text-anchor:top" o:gfxdata="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" filled="f" stroked="f">
+                  <v:textbox inset="0,0,0,0">
+                    <w:txbxContent>
+                      <w:p>
+                        <w:pPr>
+                          <w:spacing w:after="160" w:line="259" w:lineRule="auto"/>
+                          <w:ind w:left="0" w:firstLine="0"/>
+                        </w:pPr>
+                        <w:r>
+                          <w:rPr>
+                            <w:sz w:val="20"/>
+                          </w:rPr>
+                          <w:t>e</w:t>
+                        </w:r>
+                      </w:p>
+                    </w:txbxContent>
+                  </v:textbox>
+                </v:rect>
+                <v:rect id="Rectangle 41" o:spid="_x0000_s1061" style="position:absolute;left:15633;top:50878;width:382;height:1721;visibility:visible;mso-wrap-style:square;v-text-anchor:top" o:gfxdata="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" filled="f" stroked="f">
+                  <v:textbox inset="0,0,0,0">
+                    <w:txbxContent>
+                      <w:p>
+                        <w:pPr>
+                          <w:spacing w:after="160" w:line="259" w:lineRule="auto"/>
                           <w:ind w:left="0" w:firstLine="0"/>
                         </w:pPr>
                         <w:r>
@@ -4823,12 +4626,12 @@
                     </w:txbxContent>
                   </v:textbox>
                 </v:rect>
-                <v:rect id="Rectangle 42" style="position:absolute;width:3168;height:1720;left:15919;top:50878;" filled="f" stroked="f">
-                  <v:textbox inset="0,0,0,0">
-                    <w:txbxContent>
-                      <w:p>
-                        <w:pPr>
-                          <w:spacing w:before="0" w:after="160" w:line="259" w:lineRule="auto"/>
+                <v:rect id="Rectangle 42" o:spid="_x0000_s1062" style="position:absolute;left:15919;top:50878;width:3169;height:1721;visibility:visible;mso-wrap-style:square;v-text-anchor:top" o:gfxdata="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" filled="f" stroked="f">
+                  <v:textbox inset="0,0,0,0">
+                    <w:txbxContent>
+                      <w:p>
+                        <w:pPr>
+                          <w:spacing w:after="160" w:line="259" w:lineRule="auto"/>
                           <w:ind w:left="0" w:firstLine="0"/>
                         </w:pPr>
                         <w:r>
@@ -4841,48 +4644,48 @@
                     </w:txbxContent>
                   </v:textbox>
                 </v:rect>
-                <v:rect id="Rectangle 43" style="position:absolute;width:16054;height:1720;left:927;top:53196;" filled="f" stroked="f">
-                  <v:textbox inset="0,0,0,0">
-                    <w:txbxContent>
-                      <w:p>
-                        <w:pPr>
-                          <w:spacing w:before="0" w:after="160" w:line="259" w:lineRule="auto"/>
-                          <w:ind w:left="0" w:firstLine="0"/>
-                        </w:pPr>
-                        <w:r>
-                          <w:rPr>
-                            <w:sz w:val="20"/>
-                          </w:rPr>
-                          <w:t xml:space="preserve">Photoshop, After Effect</w:t>
-                        </w:r>
-                      </w:p>
-                    </w:txbxContent>
-                  </v:textbox>
-                </v:rect>
-                <v:rect id="Rectangle 44" style="position:absolute;width:660;height:1720;left:12998;top:53196;" filled="f" stroked="f">
-                  <v:textbox inset="0,0,0,0">
-                    <w:txbxContent>
-                      <w:p>
-                        <w:pPr>
-                          <w:spacing w:before="0" w:after="160" w:line="259" w:lineRule="auto"/>
-                          <w:ind w:left="0" w:firstLine="0"/>
-                        </w:pPr>
-                        <w:r>
-                          <w:rPr>
-                            <w:sz w:val="20"/>
-                          </w:rPr>
-                          <w:t xml:space="preserve">s</w:t>
-                        </w:r>
-                      </w:p>
-                    </w:txbxContent>
-                  </v:textbox>
-                </v:rect>
-                <v:rect id="Rectangle 45" style="position:absolute;width:804;height:1720;left:13506;top:53196;" filled="f" stroked="f">
-                  <v:textbox inset="0,0,0,0">
-                    <w:txbxContent>
-                      <w:p>
-                        <w:pPr>
-                          <w:spacing w:before="0" w:after="160" w:line="259" w:lineRule="auto"/>
+                <v:rect id="Rectangle 43" o:spid="_x0000_s1063" style="position:absolute;left:927;top:53196;width:16055;height:1720;visibility:visible;mso-wrap-style:square;v-text-anchor:top" o:gfxdata="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" filled="f" stroked="f">
+                  <v:textbox inset="0,0,0,0">
+                    <w:txbxContent>
+                      <w:p>
+                        <w:pPr>
+                          <w:spacing w:after="160" w:line="259" w:lineRule="auto"/>
+                          <w:ind w:left="0" w:firstLine="0"/>
+                        </w:pPr>
+                        <w:r>
+                          <w:rPr>
+                            <w:sz w:val="20"/>
+                          </w:rPr>
+                          <w:t>Photoshop, After Effect</w:t>
+                        </w:r>
+                      </w:p>
+                    </w:txbxContent>
+                  </v:textbox>
+                </v:rect>
+                <v:rect id="Rectangle 44" o:spid="_x0000_s1064" style="position:absolute;left:12998;top:53196;width:660;height:1720;visibility:visible;mso-wrap-style:square;v-text-anchor:top" o:gfxdata="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" filled="f" stroked="f">
+                  <v:textbox inset="0,0,0,0">
+                    <w:txbxContent>
+                      <w:p>
+                        <w:pPr>
+                          <w:spacing w:after="160" w:line="259" w:lineRule="auto"/>
+                          <w:ind w:left="0" w:firstLine="0"/>
+                        </w:pPr>
+                        <w:r>
+                          <w:rPr>
+                            <w:sz w:val="20"/>
+                          </w:rPr>
+                          <w:t>s</w:t>
+                        </w:r>
+                      </w:p>
+                    </w:txbxContent>
+                  </v:textbox>
+                </v:rect>
+                <v:rect id="Rectangle 45" o:spid="_x0000_s1065" style="position:absolute;left:13506;top:53196;width:804;height:1720;visibility:visible;mso-wrap-style:square;v-text-anchor:top" o:gfxdata="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" filled="f" stroked="f">
+                  <v:textbox inset="0,0,0,0">
+                    <w:txbxContent>
+                      <w:p>
+                        <w:pPr>
+                          <w:spacing w:after="160" w:line="259" w:lineRule="auto"/>
                           <w:ind w:left="0" w:firstLine="0"/>
                         </w:pPr>
                         <w:r>
@@ -4895,86 +4698,42 @@
                     </w:txbxContent>
                   </v:textbox>
                 </v:rect>
-                <v:rect id="Rectangle 46" style="position:absolute;width:5445;height:1720;left:14109;top:53196;" filled="f" stroked="f">
-                  <v:textbox inset="0,0,0,0">
-                    <w:txbxContent>
-                      <w:p>
-                        <w:pPr>
-                          <w:spacing w:before="0" w:after="160" w:line="259" w:lineRule="auto"/>
-                          <w:ind w:left="0" w:firstLine="0"/>
-                        </w:pPr>
-                        <w:r>
-                          <w:rPr>
-                            <w:sz w:val="20"/>
-                          </w:rPr>
-                          <w:t xml:space="preserve">Substan</w:t>
-                        </w:r>
-                      </w:p>
-                    </w:txbxContent>
-                  </v:textbox>
-                </v:rect>
-                <v:rect id="Rectangle 47" style="position:absolute;width:1944;height:1720;left:18209;top:53196;" filled="f" stroked="f">
-                  <v:textbox inset="0,0,0,0">
-                    <w:txbxContent>
-                      <w:p>
-                        <w:pPr>
-                          <w:spacing w:before="0" w:after="160" w:line="259" w:lineRule="auto"/>
-                          <w:ind w:left="0" w:firstLine="0"/>
-                        </w:pPr>
-                        <w:r>
-                          <w:rPr>
-                            <w:sz w:val="20"/>
-                          </w:rPr>
-                          <w:t xml:space="preserve">ce </w:t>
-                        </w:r>
-                      </w:p>
-                    </w:txbxContent>
-                  </v:textbox>
-                </v:rect>
-                <v:rect id="Rectangle 1498" style="position:absolute;width:856;height:1720;left:927;top:55514;" filled="f" stroked="f">
-                  <v:textbox inset="0,0,0,0">
-                    <w:txbxContent>
-                      <w:p>
-                        <w:pPr>
-                          <w:spacing w:before="0" w:after="160" w:line="259" w:lineRule="auto"/>
-                          <w:ind w:left="0" w:firstLine="0"/>
-                        </w:pPr>
-                        <w:r>
-                          <w:rPr>
-                            <w:sz w:val="20"/>
-                          </w:rPr>
-                          <w:t xml:space="preserve">3</w:t>
-                        </w:r>
-                      </w:p>
-                    </w:txbxContent>
-                  </v:textbox>
-                </v:rect>
-                <v:rect id="Rectangle 1499" style="position:absolute;width:6367;height:1720;left:1562;top:55514;" filled="f" stroked="f">
-                  <v:textbox inset="0,0,0,0">
-                    <w:txbxContent>
-                      <w:p>
-                        <w:pPr>
-                          <w:spacing w:before="0" w:after="160" w:line="259" w:lineRule="auto"/>
-                          <w:ind w:left="0" w:firstLine="0"/>
-                        </w:pPr>
-                        <w:r>
-                          <w:rPr>
-                            <w:sz w:val="20"/>
-                          </w:rPr>
-                          <w:t xml:space="preserve">D Painter</w:t>
-                        </w:r>
-                      </w:p>
-                    </w:txbxContent>
-                  </v:textbox>
-                </v:rect>
-                <v:rect id="Rectangle 49" style="position:absolute;width:381;height:1720;left:6359;top:55514;" filled="f" stroked="f">
-                  <v:textbox inset="0,0,0,0">
-                    <w:txbxContent>
-                      <w:p>
-                        <w:pPr>
-                          <w:spacing w:before="0" w:after="160" w:line="259" w:lineRule="auto"/>
-                          <w:ind w:left="0" w:firstLine="0"/>
-                        </w:pPr>
+                <v:rect id="Rectangle 46" o:spid="_x0000_s1066" style="position:absolute;left:14109;top:53196;width:5446;height:1720;visibility:visible;mso-wrap-style:square;v-text-anchor:top" o:gfxdata="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" filled="f" stroked="f">
+                  <v:textbox inset="0,0,0,0">
+                    <w:txbxContent>
+                      <w:p>
+                        <w:pPr>
+                          <w:spacing w:after="160" w:line="259" w:lineRule="auto"/>
+                          <w:ind w:left="0" w:firstLine="0"/>
+                        </w:pPr>
+                        <w:proofErr w:type="spellStart"/>
+                        <w:r>
+                          <w:rPr>
+                            <w:sz w:val="20"/>
+                          </w:rPr>
+                          <w:t>Substan</w:t>
+                        </w:r>
+                        <w:proofErr w:type="spellEnd"/>
+                      </w:p>
+                    </w:txbxContent>
+                  </v:textbox>
+                </v:rect>
+                <v:rect id="Rectangle 47" o:spid="_x0000_s1067" style="position:absolute;left:18209;top:53196;width:1944;height:1720;visibility:visible;mso-wrap-style:square;v-text-anchor:top" o:gfxdata="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" filled="f" stroked="f">
+                  <v:textbox inset="0,0,0,0">
+                    <w:txbxContent>
+                      <w:p>
+                        <w:pPr>
+                          <w:spacing w:after="160" w:line="259" w:lineRule="auto"/>
+                          <w:ind w:left="0" w:firstLine="0"/>
+                        </w:pPr>
+                        <w:proofErr w:type="spellStart"/>
+                        <w:r>
+                          <w:rPr>
+                            <w:sz w:val="20"/>
+                          </w:rPr>
+                          <w:t>ce</w:t>
+                        </w:r>
+                        <w:proofErr w:type="spellEnd"/>
                         <w:r>
                           <w:rPr>
                             <w:sz w:val="20"/>
@@ -4985,67 +4744,48 @@
                     </w:txbxContent>
                   </v:textbox>
                 </v:rect>
-                <v:rect id="Rectangle 50" style="position:absolute;width:562;height:1587;left:927;top:57891;" filled="f" stroked="f">
-                  <v:textbox inset="0,0,0,0">
-                    <w:txbxContent>
-                      <w:p>
-                        <w:pPr>
-                          <w:spacing w:before="0" w:after="160" w:line="259" w:lineRule="auto"/>
-                          <w:ind w:left="0" w:firstLine="0"/>
-                        </w:pPr>
-                        <w:r>
-                          <w:rPr>
-                            <w:rFonts w:cs="Arial" w:hAnsi="Arial" w:eastAsia="Arial" w:ascii="Arial"/>
-                            <w:sz w:val="20"/>
-                          </w:rPr>
-                          <w:t xml:space="preserve">-</w:t>
-                        </w:r>
-                      </w:p>
-                    </w:txbxContent>
-                  </v:textbox>
-                </v:rect>
-                <v:rect id="Rectangle 1501" style="position:absolute;width:18569;height:1720;left:1978;top:57863;" filled="f" stroked="f">
-                  <v:textbox inset="0,0,0,0">
-                    <w:txbxContent>
-                      <w:p>
-                        <w:pPr>
-                          <w:spacing w:before="0" w:after="160" w:line="259" w:lineRule="auto"/>
-                          <w:ind w:left="0" w:firstLine="0"/>
-                        </w:pPr>
-                        <w:r>
-                          <w:rPr>
-                            <w:sz w:val="20"/>
-                          </w:rPr>
-                          <w:t xml:space="preserve">D Animation: MayaBlender</w:t>
-                        </w:r>
-                      </w:p>
-                    </w:txbxContent>
-                  </v:textbox>
-                </v:rect>
-                <v:rect id="Rectangle 1500" style="position:absolute;width:856;height:1720;left:1343;top:57863;" filled="f" stroked="f">
-                  <v:textbox inset="0,0,0,0">
-                    <w:txbxContent>
-                      <w:p>
-                        <w:pPr>
-                          <w:spacing w:before="0" w:after="160" w:line="259" w:lineRule="auto"/>
-                          <w:ind w:left="0" w:firstLine="0"/>
-                        </w:pPr>
-                        <w:r>
-                          <w:rPr>
-                            <w:sz w:val="20"/>
-                          </w:rPr>
-                          <w:t xml:space="preserve">3</w:t>
-                        </w:r>
-                      </w:p>
-                    </w:txbxContent>
-                  </v:textbox>
-                </v:rect>
-                <v:rect id="Rectangle 52" style="position:absolute;width:381;height:1720;left:15951;top:57863;" filled="f" stroked="f">
-                  <v:textbox inset="0,0,0,0">
-                    <w:txbxContent>
-                      <w:p>
-                        <w:pPr>
-                          <w:spacing w:before="0" w:after="160" w:line="259" w:lineRule="auto"/>
+                <v:rect id="Rectangle 1498" o:spid="_x0000_s1068" style="position:absolute;left:927;top:55514;width:856;height:1720;visibility:visible;mso-wrap-style:square;v-text-anchor:top" o:gfxdata="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" filled="f" stroked="f">
+                  <v:textbox inset="0,0,0,0">
+                    <w:txbxContent>
+                      <w:p>
+                        <w:pPr>
+                          <w:spacing w:after="160" w:line="259" w:lineRule="auto"/>
+                          <w:ind w:left="0" w:firstLine="0"/>
+                        </w:pPr>
+                        <w:r>
+                          <w:rPr>
+                            <w:sz w:val="20"/>
+                          </w:rPr>
+                          <w:t>3</w:t>
+                        </w:r>
+                      </w:p>
+                    </w:txbxContent>
+                  </v:textbox>
+                </v:rect>
+                <v:rect id="Rectangle 1499" o:spid="_x0000_s1069" style="position:absolute;left:1562;top:55514;width:6368;height:1720;visibility:visible;mso-wrap-style:square;v-text-anchor:top" o:gfxdata="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" filled="f" stroked="f">
+                  <v:textbox inset="0,0,0,0">
+                    <w:txbxContent>
+                      <w:p>
+                        <w:pPr>
+                          <w:spacing w:after="160" w:line="259" w:lineRule="auto"/>
+                          <w:ind w:left="0" w:firstLine="0"/>
+                        </w:pPr>
+                        <w:r>
+                          <w:rPr>
+                            <w:sz w:val="20"/>
+                          </w:rPr>
+                          <w:t>D Painter</w:t>
+                        </w:r>
+                      </w:p>
+                    </w:txbxContent>
+                  </v:textbox>
+                </v:rect>
+                <v:rect id="Rectangle 49" o:spid="_x0000_s1070" style="position:absolute;left:6359;top:55514;width:382;height:1720;visibility:visible;mso-wrap-style:square;v-text-anchor:top" o:gfxdata="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" filled="f" stroked="f">
+                  <v:textbox inset="0,0,0,0">
+                    <w:txbxContent>
+                      <w:p>
+                        <w:pPr>
+                          <w:spacing w:after="160" w:line="259" w:lineRule="auto"/>
                           <w:ind w:left="0" w:firstLine="0"/>
                         </w:pPr>
                         <w:r>
@@ -5058,66 +4798,105 @@
                     </w:txbxContent>
                   </v:textbox>
                 </v:rect>
-                <v:rect id="Rectangle 53" style="position:absolute;width:516;height:1720;left:927;top:60185;" filled="f" stroked="f">
-                  <v:textbox inset="0,0,0,0">
-                    <w:txbxContent>
-                      <w:p>
-                        <w:pPr>
-                          <w:spacing w:before="0" w:after="160" w:line="259" w:lineRule="auto"/>
-                          <w:ind w:left="0" w:firstLine="0"/>
-                        </w:pPr>
-                        <w:r>
-                          <w:rPr>
-                            <w:sz w:val="20"/>
-                          </w:rPr>
-                          <w:t xml:space="preserve">-</w:t>
-                        </w:r>
-                      </w:p>
-                    </w:txbxContent>
-                  </v:textbox>
-                </v:rect>
-                <v:rect id="Rectangle 54" style="position:absolute;width:381;height:1720;left:1311;top:60185;" filled="f" stroked="f">
-                  <v:textbox inset="0,0,0,0">
-                    <w:txbxContent>
-                      <w:p>
-                        <w:pPr>
-                          <w:spacing w:before="0" w:after="160" w:line="259" w:lineRule="auto"/>
-                          <w:ind w:left="0" w:firstLine="0"/>
-                        </w:pPr>
+                <v:rect id="Rectangle 50" o:spid="_x0000_s1071" style="position:absolute;left:927;top:57891;width:562;height:1588;visibility:visible;mso-wrap-style:square;v-text-anchor:top" o:gfxdata="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" filled="f" stroked="f">
+                  <v:textbox inset="0,0,0,0">
+                    <w:txbxContent>
+                      <w:p>
+                        <w:pPr>
+                          <w:spacing w:after="160" w:line="259" w:lineRule="auto"/>
+                          <w:ind w:left="0" w:firstLine="0"/>
+                        </w:pPr>
+                        <w:r>
+                          <w:rPr>
+                            <w:rFonts w:ascii="Arial" w:eastAsia="Arial" w:hAnsi="Arial" w:cs="Arial"/>
+                            <w:sz w:val="20"/>
+                          </w:rPr>
+                          <w:t>-</w:t>
+                        </w:r>
+                      </w:p>
+                    </w:txbxContent>
+                  </v:textbox>
+                </v:rect>
+                <v:rect id="Rectangle 1501" o:spid="_x0000_s1072" style="position:absolute;left:1978;top:57863;width:20952;height:1721;visibility:visible;mso-wrap-style:square;v-text-anchor:top" o:gfxdata="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" filled="f" stroked="f">
+                  <v:textbox inset="0,0,0,0">
+                    <w:txbxContent>
+                      <w:p>
+                        <w:pPr>
+                          <w:spacing w:after="160" w:line="259" w:lineRule="auto"/>
+                          <w:ind w:left="0" w:firstLine="0"/>
+                        </w:pPr>
+                        <w:proofErr w:type="gramStart"/>
+                        <w:r>
+                          <w:rPr>
+                            <w:sz w:val="20"/>
+                          </w:rPr>
+                          <w:t>D</w:t>
+                        </w:r>
                         <w:r>
                           <w:rPr>
                             <w:sz w:val="20"/>
                           </w:rPr>
                           <w:t xml:space="preserve"> </w:t>
                         </w:r>
-                      </w:p>
-                    </w:txbxContent>
-                  </v:textbox>
-                </v:rect>
-                <v:rect id="Rectangle 55" style="position:absolute;width:5430;height:1720;left:1597;top:60185;" filled="f" stroked="f">
-                  <v:textbox inset="0,0,0,0">
-                    <w:txbxContent>
-                      <w:p>
-                        <w:pPr>
-                          <w:spacing w:before="0" w:after="160" w:line="259" w:lineRule="auto"/>
-                          <w:ind w:left="0" w:firstLine="0"/>
-                        </w:pPr>
-                        <w:r>
-                          <w:rPr>
-                            <w:sz w:val="20"/>
-                          </w:rPr>
-                          <w:t xml:space="preserve">AI Tools</w:t>
-                        </w:r>
-                      </w:p>
-                    </w:txbxContent>
-                  </v:textbox>
-                </v:rect>
-                <v:rect id="Rectangle 1503" style="position:absolute;width:381;height:1720;left:6042;top:60185;" filled="f" stroked="f">
-                  <v:textbox inset="0,0,0,0">
-                    <w:txbxContent>
-                      <w:p>
-                        <w:pPr>
-                          <w:spacing w:before="0" w:after="160" w:line="259" w:lineRule="auto"/>
+                        <w:r>
+                          <w:rPr>
+                            <w:sz w:val="20"/>
+                          </w:rPr>
+                          <w:t>:</w:t>
+                        </w:r>
+                        <w:proofErr w:type="gramEnd"/>
+                        <w:r>
+                          <w:rPr>
+                            <w:sz w:val="20"/>
+                          </w:rPr>
+                          <w:t xml:space="preserve"> Maya</w:t>
+                        </w:r>
+                        <w:r>
+                          <w:rPr>
+                            <w:sz w:val="20"/>
+                          </w:rPr>
+                          <w:t xml:space="preserve">, </w:t>
+                        </w:r>
+                        <w:r>
+                          <w:rPr>
+                            <w:sz w:val="20"/>
+                          </w:rPr>
+                          <w:t>Blender</w:t>
+                        </w:r>
+                        <w:r>
+                          <w:rPr>
+                            <w:sz w:val="20"/>
+                          </w:rPr>
+                          <w:t>, Unreal Engine, Unity</w:t>
+                        </w:r>
+                      </w:p>
+                    </w:txbxContent>
+                  </v:textbox>
+                </v:rect>
+                <v:rect id="Rectangle 1500" o:spid="_x0000_s1073" style="position:absolute;left:1343;top:57863;width:856;height:1721;visibility:visible;mso-wrap-style:square;v-text-anchor:top" o:gfxdata="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" filled="f" stroked="f">
+                  <v:textbox inset="0,0,0,0">
+                    <w:txbxContent>
+                      <w:p>
+                        <w:pPr>
+                          <w:spacing w:after="160" w:line="259" w:lineRule="auto"/>
+                          <w:ind w:left="0" w:firstLine="0"/>
+                        </w:pPr>
+                        <w:r>
+                          <w:rPr>
+                            <w:sz w:val="20"/>
+                          </w:rPr>
+                          <w:t>3</w:t>
+                        </w:r>
+                      </w:p>
+                    </w:txbxContent>
+                  </v:textbox>
+                </v:rect>
+                <v:rect id="Rectangle 52" o:spid="_x0000_s1074" style="position:absolute;left:15951;top:57863;width:381;height:1721;visibility:visible;mso-wrap-style:square;v-text-anchor:top" o:gfxdata="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" filled="f" stroked="f">
+                  <v:textbox inset="0,0,0,0">
+                    <w:txbxContent>
+                      <w:p>
+                        <w:pPr>
+                          <w:spacing w:after="160" w:line="259" w:lineRule="auto"/>
                           <w:ind w:left="0" w:firstLine="0"/>
                         </w:pPr>
                         <w:r>
@@ -5130,66 +4909,30 @@
                     </w:txbxContent>
                   </v:textbox>
                 </v:rect>
-                <v:rect id="Rectangle 1502" style="position:absolute;width:452;height:1720;left:5692;top:60185;" filled="f" stroked="f">
-                  <v:textbox inset="0,0,0,0">
-                    <w:txbxContent>
-                      <w:p>
-                        <w:pPr>
-                          <w:spacing w:before="0" w:after="160" w:line="259" w:lineRule="auto"/>
-                          <w:ind w:left="0" w:firstLine="0"/>
-                        </w:pPr>
-                        <w:r>
-                          <w:rPr>
-                            <w:sz w:val="20"/>
-                          </w:rPr>
-                          <w:t xml:space="preserve">:</w:t>
-                        </w:r>
-                      </w:p>
-                    </w:txbxContent>
-                  </v:textbox>
-                </v:rect>
-                <v:rect id="Rectangle 57" style="position:absolute;width:6965;height:1720;left:6327;top:60185;" filled="f" stroked="f">
-                  <v:textbox inset="0,0,0,0">
-                    <w:txbxContent>
-                      <w:p>
-                        <w:pPr>
-                          <w:spacing w:before="0" w:after="160" w:line="259" w:lineRule="auto"/>
-                          <w:ind w:left="0" w:firstLine="0"/>
-                        </w:pPr>
-                        <w:r>
-                          <w:rPr>
-                            <w:sz w:val="20"/>
-                          </w:rPr>
-                          <w:t xml:space="preserve">Run Way, </w:t>
-                        </w:r>
-                      </w:p>
-                    </w:txbxContent>
-                  </v:textbox>
-                </v:rect>
-                <v:rect id="Rectangle 58" style="position:absolute;width:7982;height:1720;left:11569;top:60185;" filled="f" stroked="f">
-                  <v:textbox inset="0,0,0,0">
-                    <w:txbxContent>
-                      <w:p>
-                        <w:pPr>
-                          <w:spacing w:before="0" w:after="160" w:line="259" w:lineRule="auto"/>
-                          <w:ind w:left="0" w:firstLine="0"/>
-                        </w:pPr>
-                        <w:r>
-                          <w:rPr>
-                            <w:sz w:val="20"/>
-                          </w:rPr>
-                          <w:t xml:space="preserve">Midjourney</w:t>
-                        </w:r>
-                      </w:p>
-                    </w:txbxContent>
-                  </v:textbox>
-                </v:rect>
-                <v:rect id="Rectangle 59" style="position:absolute;width:381;height:1720;left:17574;top:60185;" filled="f" stroked="f">
-                  <v:textbox inset="0,0,0,0">
-                    <w:txbxContent>
-                      <w:p>
-                        <w:pPr>
-                          <w:spacing w:before="0" w:after="160" w:line="259" w:lineRule="auto"/>
+                <v:rect id="Rectangle 53" o:spid="_x0000_s1075" style="position:absolute;left:927;top:60185;width:516;height:1720;visibility:visible;mso-wrap-style:square;v-text-anchor:top" o:gfxdata="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" filled="f" stroked="f">
+                  <v:textbox inset="0,0,0,0">
+                    <w:txbxContent>
+                      <w:p>
+                        <w:pPr>
+                          <w:spacing w:after="160" w:line="259" w:lineRule="auto"/>
+                          <w:ind w:left="0" w:firstLine="0"/>
+                        </w:pPr>
+                        <w:r>
+                          <w:rPr>
+                            <w:sz w:val="20"/>
+                          </w:rPr>
+                          <w:t>-</w:t>
+                        </w:r>
+                      </w:p>
+                    </w:txbxContent>
+                  </v:textbox>
+                </v:rect>
+                <v:rect id="Rectangle 54" o:spid="_x0000_s1076" style="position:absolute;left:1311;top:60185;width:382;height:1720;visibility:visible;mso-wrap-style:square;v-text-anchor:top" o:gfxdata="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" filled="f" stroked="f">
+                  <v:textbox inset="0,0,0,0">
+                    <w:txbxContent>
+                      <w:p>
+                        <w:pPr>
+                          <w:spacing w:after="160" w:line="259" w:lineRule="auto"/>
                           <w:ind w:left="0" w:firstLine="0"/>
                         </w:pPr>
                         <w:r>
@@ -5202,14 +4945,76 @@
                     </w:txbxContent>
                   </v:textbox>
                 </v:rect>
-                <v:rect id="Rectangle 60" style="position:absolute;width:804;height:1720;left:927;top:62503;" filled="f" stroked="f">
-                  <v:textbox inset="0,0,0,0">
-                    <w:txbxContent>
-                      <w:p>
-                        <w:pPr>
-                          <w:spacing w:before="0" w:after="160" w:line="259" w:lineRule="auto"/>
-                          <w:ind w:left="0" w:firstLine="0"/>
-                        </w:pPr>
+                <v:rect id="Rectangle 55" o:spid="_x0000_s1077" style="position:absolute;left:1597;top:60185;width:5430;height:1720;visibility:visible;mso-wrap-style:square;v-text-anchor:top" o:gfxdata="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" filled="f" stroked="f">
+                  <v:textbox inset="0,0,0,0">
+                    <w:txbxContent>
+                      <w:p>
+                        <w:pPr>
+                          <w:spacing w:after="160" w:line="259" w:lineRule="auto"/>
+                          <w:ind w:left="0" w:firstLine="0"/>
+                        </w:pPr>
+                        <w:r>
+                          <w:rPr>
+                            <w:sz w:val="20"/>
+                          </w:rPr>
+                          <w:t>AI Tools</w:t>
+                        </w:r>
+                      </w:p>
+                    </w:txbxContent>
+                  </v:textbox>
+                </v:rect>
+                <v:rect id="Rectangle 1503" o:spid="_x0000_s1078" style="position:absolute;left:6042;top:60185;width:381;height:1720;visibility:visible;mso-wrap-style:square;v-text-anchor:top" o:gfxdata="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" filled="f" stroked="f">
+                  <v:textbox inset="0,0,0,0">
+                    <w:txbxContent>
+                      <w:p>
+                        <w:pPr>
+                          <w:spacing w:after="160" w:line="259" w:lineRule="auto"/>
+                          <w:ind w:left="0" w:firstLine="0"/>
+                        </w:pPr>
+                        <w:r>
+                          <w:rPr>
+                            <w:sz w:val="20"/>
+                          </w:rPr>
+                          <w:t xml:space="preserve"> </w:t>
+                        </w:r>
+                      </w:p>
+                    </w:txbxContent>
+                  </v:textbox>
+                </v:rect>
+                <v:rect id="Rectangle 1502" o:spid="_x0000_s1079" style="position:absolute;left:5692;top:60185;width:453;height:1720;visibility:visible;mso-wrap-style:square;v-text-anchor:top" o:gfxdata="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" filled="f" stroked="f">
+                  <v:textbox inset="0,0,0,0">
+                    <w:txbxContent>
+                      <w:p>
+                        <w:pPr>
+                          <w:spacing w:after="160" w:line="259" w:lineRule="auto"/>
+                          <w:ind w:left="0" w:firstLine="0"/>
+                        </w:pPr>
+                        <w:r>
+                          <w:rPr>
+                            <w:sz w:val="20"/>
+                          </w:rPr>
+                          <w:t>:</w:t>
+                        </w:r>
+                      </w:p>
+                    </w:txbxContent>
+                  </v:textbox>
+                </v:rect>
+                <v:rect id="Rectangle 57" o:spid="_x0000_s1080" style="position:absolute;left:6327;top:60185;width:6966;height:1720;visibility:visible;mso-wrap-style:square;v-text-anchor:top" o:gfxdata="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" filled="f" stroked="f">
+                  <v:textbox inset="0,0,0,0">
+                    <w:txbxContent>
+                      <w:p>
+                        <w:pPr>
+                          <w:spacing w:after="160" w:line="259" w:lineRule="auto"/>
+                          <w:ind w:left="0" w:firstLine="0"/>
+                        </w:pPr>
+                        <w:proofErr w:type="gramStart"/>
+                        <w:r>
+                          <w:rPr>
+                            <w:sz w:val="20"/>
+                          </w:rPr>
+                          <w:t>Run Way</w:t>
+                        </w:r>
+                        <w:proofErr w:type="gramEnd"/>
                         <w:r>
                           <w:rPr>
                             <w:sz w:val="20"/>
@@ -5220,17 +5025,78 @@
                     </w:txbxContent>
                   </v:textbox>
                 </v:rect>
-                <v:rect id="Rectangle 61" style="position:absolute;width:18870;height:1720;left:1533;top:62503;" filled="f" stroked="f">
-                  <v:textbox inset="0,0,0,0">
-                    <w:txbxContent>
-                      <w:p>
-                        <w:pPr>
-                          <w:spacing w:before="0" w:after="160" w:line="259" w:lineRule="auto"/>
-                          <w:ind w:left="0" w:firstLine="0"/>
-                        </w:pPr>
-                        <w:r>
-                          <w:rPr>
-                            <w:rFonts w:cs="Calibri" w:hAnsi="Calibri" w:eastAsia="Calibri" w:ascii="Calibri"/>
+                <v:rect id="Rectangle 58" o:spid="_x0000_s1081" style="position:absolute;left:11569;top:60185;width:13681;height:1720;visibility:visible;mso-wrap-style:square;v-text-anchor:top" o:gfxdata="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" filled="f" stroked="f">
+                  <v:textbox inset="0,0,0,0">
+                    <w:txbxContent>
+                      <w:p>
+                        <w:pPr>
+                          <w:spacing w:after="160" w:line="259" w:lineRule="auto"/>
+                          <w:ind w:left="0" w:firstLine="0"/>
+                        </w:pPr>
+                        <w:proofErr w:type="gramStart"/>
+                        <w:r>
+                          <w:rPr>
+                            <w:sz w:val="20"/>
+                          </w:rPr>
+                          <w:t>Midjourney</w:t>
+                        </w:r>
+                        <w:r>
+                          <w:rPr>
+                            <w:sz w:val="20"/>
+                          </w:rPr>
+                          <w:t xml:space="preserve">  Kling</w:t>
+                        </w:r>
+                        <w:proofErr w:type="gramEnd"/>
+                      </w:p>
+                    </w:txbxContent>
+                  </v:textbox>
+                </v:rect>
+                <v:rect id="Rectangle 59" o:spid="_x0000_s1082" style="position:absolute;left:17574;top:60185;width:382;height:1720;visibility:visible;mso-wrap-style:square;v-text-anchor:top" o:gfxdata="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" filled="f" stroked="f">
+                  <v:textbox inset="0,0,0,0">
+                    <w:txbxContent>
+                      <w:p>
+                        <w:pPr>
+                          <w:spacing w:after="160" w:line="259" w:lineRule="auto"/>
+                          <w:ind w:left="0" w:firstLine="0"/>
+                        </w:pPr>
+                        <w:r>
+                          <w:rPr>
+                            <w:sz w:val="20"/>
+                          </w:rPr>
+                          <w:t>, f</w:t>
+                        </w:r>
+                      </w:p>
+                    </w:txbxContent>
+                  </v:textbox>
+                </v:rect>
+                <v:rect id="Rectangle 60" o:spid="_x0000_s1083" style="position:absolute;left:927;top:62503;width:804;height:1720;visibility:visible;mso-wrap-style:square;v-text-anchor:top" o:gfxdata="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" filled="f" stroked="f">
+                  <v:textbox inset="0,0,0,0">
+                    <w:txbxContent>
+                      <w:p>
+                        <w:pPr>
+                          <w:spacing w:after="160" w:line="259" w:lineRule="auto"/>
+                          <w:ind w:left="0" w:firstLine="0"/>
+                        </w:pPr>
+                        <w:r>
+                          <w:rPr>
+                            <w:sz w:val="20"/>
+                          </w:rPr>
+                          <w:t xml:space="preserve">, </w:t>
+                        </w:r>
+                      </w:p>
+                    </w:txbxContent>
+                  </v:textbox>
+                </v:rect>
+                <v:rect id="Rectangle 61" o:spid="_x0000_s1084" style="position:absolute;left:1533;top:62503;width:18871;height:1720;visibility:visible;mso-wrap-style:square;v-text-anchor:top" o:gfxdata="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" filled="f" stroked="f">
+                  <v:textbox inset="0,0,0,0">
+                    <w:txbxContent>
+                      <w:p>
+                        <w:pPr>
+                          <w:spacing w:after="160" w:line="259" w:lineRule="auto"/>
+                          <w:ind w:left="0" w:firstLine="0"/>
+                        </w:pPr>
+                        <w:r>
+                          <w:rPr>
                             <w:sz w:val="20"/>
                           </w:rPr>
                           <w:t xml:space="preserve">Nano banana, and others… </w:t>
@@ -5239,12 +5105,12 @@
                     </w:txbxContent>
                   </v:textbox>
                 </v:rect>
-                <v:rect id="Rectangle 62" style="position:absolute;width:381;height:1720;left:15760;top:62503;" filled="f" stroked="f">
-                  <v:textbox inset="0,0,0,0">
-                    <w:txbxContent>
-                      <w:p>
-                        <w:pPr>
-                          <w:spacing w:before="0" w:after="160" w:line="259" w:lineRule="auto"/>
+                <v:rect id="Rectangle 62" o:spid="_x0000_s1085" style="position:absolute;left:15760;top:62503;width:382;height:1720;visibility:visible;mso-wrap-style:square;v-text-anchor:top" o:gfxdata="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" filled="f" stroked="f">
+                  <v:textbox inset="0,0,0,0">
+                    <w:txbxContent>
+                      <w:p>
+                        <w:pPr>
+                          <w:spacing w:after="160" w:line="259" w:lineRule="auto"/>
                           <w:ind w:left="0" w:firstLine="0"/>
                         </w:pPr>
                         <w:r>
@@ -5257,30 +5123,30 @@
                     </w:txbxContent>
                   </v:textbox>
                 </v:rect>
-                <v:rect id="Rectangle 63" style="position:absolute;width:516;height:1720;left:927;top:64820;" filled="f" stroked="f">
-                  <v:textbox inset="0,0,0,0">
-                    <w:txbxContent>
-                      <w:p>
-                        <w:pPr>
-                          <w:spacing w:before="0" w:after="160" w:line="259" w:lineRule="auto"/>
-                          <w:ind w:left="0" w:firstLine="0"/>
-                        </w:pPr>
-                        <w:r>
-                          <w:rPr>
-                            <w:sz w:val="20"/>
-                          </w:rPr>
-                          <w:t xml:space="preserve">-</w:t>
-                        </w:r>
-                      </w:p>
-                    </w:txbxContent>
-                  </v:textbox>
-                </v:rect>
-                <v:rect id="Rectangle 64" style="position:absolute;width:381;height:1720;left:1311;top:64820;" filled="f" stroked="f">
-                  <v:textbox inset="0,0,0,0">
-                    <w:txbxContent>
-                      <w:p>
-                        <w:pPr>
-                          <w:spacing w:before="0" w:after="160" w:line="259" w:lineRule="auto"/>
+                <v:rect id="Rectangle 63" o:spid="_x0000_s1086" style="position:absolute;left:927;top:64820;width:516;height:1721;visibility:visible;mso-wrap-style:square;v-text-anchor:top" o:gfxdata="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" filled="f" stroked="f">
+                  <v:textbox inset="0,0,0,0">
+                    <w:txbxContent>
+                      <w:p>
+                        <w:pPr>
+                          <w:spacing w:after="160" w:line="259" w:lineRule="auto"/>
+                          <w:ind w:left="0" w:firstLine="0"/>
+                        </w:pPr>
+                        <w:r>
+                          <w:rPr>
+                            <w:sz w:val="20"/>
+                          </w:rPr>
+                          <w:t>-</w:t>
+                        </w:r>
+                      </w:p>
+                    </w:txbxContent>
+                  </v:textbox>
+                </v:rect>
+                <v:rect id="Rectangle 64" o:spid="_x0000_s1087" style="position:absolute;left:1311;top:64820;width:382;height:1721;visibility:visible;mso-wrap-style:square;v-text-anchor:top" o:gfxdata="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" filled="f" stroked="f">
+                  <v:textbox inset="0,0,0,0">
+                    <w:txbxContent>
+                      <w:p>
+                        <w:pPr>
+                          <w:spacing w:after="160" w:line="259" w:lineRule="auto"/>
                           <w:ind w:left="0" w:firstLine="0"/>
                         </w:pPr>
                         <w:r>
@@ -5293,66 +5159,66 @@
                     </w:txbxContent>
                   </v:textbox>
                 </v:rect>
-                <v:rect id="Rectangle 65" style="position:absolute;width:1974;height:1720;left:1597;top:64820;" filled="f" stroked="f">
-                  <v:textbox inset="0,0,0,0">
-                    <w:txbxContent>
-                      <w:p>
-                        <w:pPr>
-                          <w:spacing w:before="0" w:after="160" w:line="259" w:lineRule="auto"/>
-                          <w:ind w:left="0" w:firstLine="0"/>
-                        </w:pPr>
-                        <w:r>
-                          <w:rPr>
-                            <w:sz w:val="20"/>
-                          </w:rPr>
-                          <w:t xml:space="preserve">UX</w:t>
-                        </w:r>
-                      </w:p>
-                    </w:txbxContent>
-                  </v:textbox>
-                </v:rect>
-                <v:rect id="Rectangle 66" style="position:absolute;width:651;height:1720;left:3089;top:64820;" filled="f" stroked="f">
-                  <v:textbox inset="0,0,0,0">
-                    <w:txbxContent>
-                      <w:p>
-                        <w:pPr>
-                          <w:spacing w:before="0" w:after="160" w:line="259" w:lineRule="auto"/>
-                          <w:ind w:left="0" w:firstLine="0"/>
-                        </w:pPr>
-                        <w:r>
-                          <w:rPr>
-                            <w:sz w:val="20"/>
-                          </w:rPr>
-                          <w:t xml:space="preserve">/</w:t>
-                        </w:r>
-                      </w:p>
-                    </w:txbxContent>
-                  </v:textbox>
-                </v:rect>
-                <v:rect id="Rectangle 67" style="position:absolute;width:3165;height:1720;left:3565;top:64820;" filled="f" stroked="f">
-                  <v:textbox inset="0,0,0,0">
-                    <w:txbxContent>
-                      <w:p>
-                        <w:pPr>
-                          <w:spacing w:before="0" w:after="160" w:line="259" w:lineRule="auto"/>
-                          <w:ind w:left="0" w:firstLine="0"/>
-                        </w:pPr>
-                        <w:r>
-                          <w:rPr>
-                            <w:sz w:val="20"/>
-                          </w:rPr>
-                          <w:t xml:space="preserve">UI in</w:t>
-                        </w:r>
-                      </w:p>
-                    </w:txbxContent>
-                  </v:textbox>
-                </v:rect>
-                <v:rect id="Rectangle 68" style="position:absolute;width:381;height:1720;left:5946;top:64820;" filled="f" stroked="f">
-                  <v:textbox inset="0,0,0,0">
-                    <w:txbxContent>
-                      <w:p>
-                        <w:pPr>
-                          <w:spacing w:before="0" w:after="160" w:line="259" w:lineRule="auto"/>
+                <v:rect id="Rectangle 65" o:spid="_x0000_s1088" style="position:absolute;left:1597;top:64820;width:1974;height:1721;visibility:visible;mso-wrap-style:square;v-text-anchor:top" o:gfxdata="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" filled="f" stroked="f">
+                  <v:textbox inset="0,0,0,0">
+                    <w:txbxContent>
+                      <w:p>
+                        <w:pPr>
+                          <w:spacing w:after="160" w:line="259" w:lineRule="auto"/>
+                          <w:ind w:left="0" w:firstLine="0"/>
+                        </w:pPr>
+                        <w:r>
+                          <w:rPr>
+                            <w:sz w:val="20"/>
+                          </w:rPr>
+                          <w:t>UX</w:t>
+                        </w:r>
+                      </w:p>
+                    </w:txbxContent>
+                  </v:textbox>
+                </v:rect>
+                <v:rect id="Rectangle 66" o:spid="_x0000_s1089" style="position:absolute;left:3089;top:64820;width:652;height:1721;visibility:visible;mso-wrap-style:square;v-text-anchor:top" o:gfxdata="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" filled="f" stroked="f">
+                  <v:textbox inset="0,0,0,0">
+                    <w:txbxContent>
+                      <w:p>
+                        <w:pPr>
+                          <w:spacing w:after="160" w:line="259" w:lineRule="auto"/>
+                          <w:ind w:left="0" w:firstLine="0"/>
+                        </w:pPr>
+                        <w:r>
+                          <w:rPr>
+                            <w:sz w:val="20"/>
+                          </w:rPr>
+                          <w:t>/</w:t>
+                        </w:r>
+                      </w:p>
+                    </w:txbxContent>
+                  </v:textbox>
+                </v:rect>
+                <v:rect id="Rectangle 67" o:spid="_x0000_s1090" style="position:absolute;left:3565;top:64820;width:3165;height:1721;visibility:visible;mso-wrap-style:square;v-text-anchor:top" o:gfxdata="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" filled="f" stroked="f">
+                  <v:textbox inset="0,0,0,0">
+                    <w:txbxContent>
+                      <w:p>
+                        <w:pPr>
+                          <w:spacing w:after="160" w:line="259" w:lineRule="auto"/>
+                          <w:ind w:left="0" w:firstLine="0"/>
+                        </w:pPr>
+                        <w:r>
+                          <w:rPr>
+                            <w:sz w:val="20"/>
+                          </w:rPr>
+                          <w:t>UI in</w:t>
+                        </w:r>
+                      </w:p>
+                    </w:txbxContent>
+                  </v:textbox>
+                </v:rect>
+                <v:rect id="Rectangle 68" o:spid="_x0000_s1091" style="position:absolute;left:5946;top:64820;width:382;height:1721;visibility:visible;mso-wrap-style:square;v-text-anchor:top" o:gfxdata="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" filled="f" stroked="f">
+                  <v:textbox inset="0,0,0,0">
+                    <w:txbxContent>
+                      <w:p>
+                        <w:pPr>
+                          <w:spacing w:after="160" w:line="259" w:lineRule="auto"/>
                           <w:ind w:left="0" w:firstLine="0"/>
                         </w:pPr>
                         <w:r>
@@ -5365,12 +5231,12 @@
                     </w:txbxContent>
                   </v:textbox>
                 </v:rect>
-                <v:rect id="Rectangle 69" style="position:absolute;width:4476;height:1720;left:6232;top:64820;" filled="f" stroked="f">
-                  <v:textbox inset="0,0,0,0">
-                    <w:txbxContent>
-                      <w:p>
-                        <w:pPr>
-                          <w:spacing w:before="0" w:after="160" w:line="259" w:lineRule="auto"/>
+                <v:rect id="Rectangle 69" o:spid="_x0000_s1092" style="position:absolute;left:6232;top:64820;width:4476;height:1721;visibility:visible;mso-wrap-style:square;v-text-anchor:top" o:gfxdata="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" filled="f" stroked="f">
+                  <v:textbox inset="0,0,0,0">
+                    <w:txbxContent>
+                      <w:p>
+                        <w:pPr>
+                          <w:spacing w:after="160" w:line="259" w:lineRule="auto"/>
                           <w:ind w:left="0" w:firstLine="0"/>
                         </w:pPr>
                         <w:r>
@@ -5383,17 +5249,17 @@
                     </w:txbxContent>
                   </v:textbox>
                 </v:rect>
-                <v:rect id="Rectangle 70" style="position:absolute;width:469;height:1587;left:9632;top:64848;" filled="f" stroked="f">
-                  <v:textbox inset="0,0,0,0">
-                    <w:txbxContent>
-                      <w:p>
-                        <w:pPr>
-                          <w:spacing w:before="0" w:after="160" w:line="259" w:lineRule="auto"/>
-                          <w:ind w:left="0" w:firstLine="0"/>
-                        </w:pPr>
-                        <w:r>
-                          <w:rPr>
-                            <w:rFonts w:cs="Arial" w:hAnsi="Arial" w:eastAsia="Arial" w:ascii="Arial"/>
+                <v:rect id="Rectangle 70" o:spid="_x0000_s1093" style="position:absolute;left:9632;top:64848;width:470;height:1588;visibility:visible;mso-wrap-style:square;v-text-anchor:top" o:gfxdata="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" filled="f" stroked="f">
+                  <v:textbox inset="0,0,0,0">
+                    <w:txbxContent>
+                      <w:p>
+                        <w:pPr>
+                          <w:spacing w:after="160" w:line="259" w:lineRule="auto"/>
+                          <w:ind w:left="0" w:firstLine="0"/>
+                        </w:pPr>
+                        <w:r>
+                          <w:rPr>
+                            <w:rFonts w:ascii="Arial" w:eastAsia="Arial" w:hAnsi="Arial" w:cs="Arial"/>
                             <w:sz w:val="20"/>
                           </w:rPr>
                           <w:t xml:space="preserve"> </w:t>
@@ -5402,30 +5268,30 @@
                     </w:txbxContent>
                   </v:textbox>
                 </v:rect>
-                <v:rect id="Rectangle 71" style="position:absolute;width:516;height:1720;left:927;top:67170;" filled="f" stroked="f">
-                  <v:textbox inset="0,0,0,0">
-                    <w:txbxContent>
-                      <w:p>
-                        <w:pPr>
-                          <w:spacing w:before="0" w:after="160" w:line="259" w:lineRule="auto"/>
-                          <w:ind w:left="0" w:firstLine="0"/>
-                        </w:pPr>
-                        <w:r>
-                          <w:rPr>
-                            <w:sz w:val="20"/>
-                          </w:rPr>
-                          <w:t xml:space="preserve">-</w:t>
-                        </w:r>
-                      </w:p>
-                    </w:txbxContent>
-                  </v:textbox>
-                </v:rect>
-                <v:rect id="Rectangle 72" style="position:absolute;width:381;height:1720;left:1311;top:67170;" filled="f" stroked="f">
-                  <v:textbox inset="0,0,0,0">
-                    <w:txbxContent>
-                      <w:p>
-                        <w:pPr>
-                          <w:spacing w:before="0" w:after="160" w:line="259" w:lineRule="auto"/>
+                <v:rect id="Rectangle 71" o:spid="_x0000_s1094" style="position:absolute;left:927;top:67170;width:516;height:1720;visibility:visible;mso-wrap-style:square;v-text-anchor:top" o:gfxdata="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" filled="f" stroked="f">
+                  <v:textbox inset="0,0,0,0">
+                    <w:txbxContent>
+                      <w:p>
+                        <w:pPr>
+                          <w:spacing w:after="160" w:line="259" w:lineRule="auto"/>
+                          <w:ind w:left="0" w:firstLine="0"/>
+                        </w:pPr>
+                        <w:r>
+                          <w:rPr>
+                            <w:sz w:val="20"/>
+                          </w:rPr>
+                          <w:t>-</w:t>
+                        </w:r>
+                      </w:p>
+                    </w:txbxContent>
+                  </v:textbox>
+                </v:rect>
+                <v:rect id="Rectangle 72" o:spid="_x0000_s1095" style="position:absolute;left:1311;top:67170;width:382;height:1720;visibility:visible;mso-wrap-style:square;v-text-anchor:top" o:gfxdata="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" filled="f" stroked="f">
+                  <v:textbox inset="0,0,0,0">
+                    <w:txbxContent>
+                      <w:p>
+                        <w:pPr>
+                          <w:spacing w:after="160" w:line="259" w:lineRule="auto"/>
                           <w:ind w:left="0" w:firstLine="0"/>
                         </w:pPr>
                         <w:r>
@@ -5438,30 +5304,30 @@
                     </w:txbxContent>
                   </v:textbox>
                 </v:rect>
-                <v:rect id="Rectangle 73" style="position:absolute;width:2364;height:1720;left:1597;top:67170;" filled="f" stroked="f">
-                  <v:textbox inset="0,0,0,0">
-                    <w:txbxContent>
-                      <w:p>
-                        <w:pPr>
-                          <w:spacing w:before="0" w:after="160" w:line="259" w:lineRule="auto"/>
-                          <w:ind w:left="0" w:firstLine="0"/>
-                        </w:pPr>
-                        <w:r>
-                          <w:rPr>
-                            <w:sz w:val="20"/>
-                          </w:rPr>
-                          <w:t xml:space="preserve">Pro</w:t>
-                        </w:r>
-                      </w:p>
-                    </w:txbxContent>
-                  </v:textbox>
-                </v:rect>
-                <v:rect id="Rectangle 74" style="position:absolute;width:381;height:1720;left:3375;top:67170;" filled="f" stroked="f">
-                  <v:textbox inset="0,0,0,0">
-                    <w:txbxContent>
-                      <w:p>
-                        <w:pPr>
-                          <w:spacing w:before="0" w:after="160" w:line="259" w:lineRule="auto"/>
+                <v:rect id="Rectangle 73" o:spid="_x0000_s1096" style="position:absolute;left:1597;top:67170;width:2364;height:1720;visibility:visible;mso-wrap-style:square;v-text-anchor:top" o:gfxdata="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" filled="f" stroked="f">
+                  <v:textbox inset="0,0,0,0">
+                    <w:txbxContent>
+                      <w:p>
+                        <w:pPr>
+                          <w:spacing w:after="160" w:line="259" w:lineRule="auto"/>
+                          <w:ind w:left="0" w:firstLine="0"/>
+                        </w:pPr>
+                        <w:r>
+                          <w:rPr>
+                            <w:sz w:val="20"/>
+                          </w:rPr>
+                          <w:t>Pro</w:t>
+                        </w:r>
+                      </w:p>
+                    </w:txbxContent>
+                  </v:textbox>
+                </v:rect>
+                <v:rect id="Rectangle 74" o:spid="_x0000_s1097" style="position:absolute;left:3375;top:67170;width:381;height:1720;visibility:visible;mso-wrap-style:square;v-text-anchor:top" o:gfxdata="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" filled="f" stroked="f">
+                  <v:textbox inset="0,0,0,0">
+                    <w:txbxContent>
+                      <w:p>
+                        <w:pPr>
+                          <w:spacing w:after="160" w:line="259" w:lineRule="auto"/>
                           <w:ind w:left="0" w:firstLine="0"/>
                         </w:pPr>
                         <w:r>
@@ -5474,30 +5340,30 @@
                     </w:txbxContent>
                   </v:textbox>
                 </v:rect>
-                <v:rect id="Rectangle 75" style="position:absolute;width:4513;height:1720;left:3660;top:67170;" filled="f" stroked="f">
-                  <v:textbox inset="0,0,0,0">
-                    <w:txbxContent>
-                      <w:p>
-                        <w:pPr>
-                          <w:spacing w:before="0" w:after="160" w:line="259" w:lineRule="auto"/>
-                          <w:ind w:left="0" w:firstLine="0"/>
-                        </w:pPr>
-                        <w:r>
-                          <w:rPr>
-                            <w:sz w:val="20"/>
-                          </w:rPr>
-                          <w:t xml:space="preserve">Create</w:t>
-                        </w:r>
-                      </w:p>
-                    </w:txbxContent>
-                  </v:textbox>
-                </v:rect>
-                <v:rect id="Rectangle 76" style="position:absolute;width:381;height:1720;left:7058;top:67170;" filled="f" stroked="f">
-                  <v:textbox inset="0,0,0,0">
-                    <w:txbxContent>
-                      <w:p>
-                        <w:pPr>
-                          <w:spacing w:before="0" w:after="160" w:line="259" w:lineRule="auto"/>
+                <v:rect id="Rectangle 75" o:spid="_x0000_s1098" style="position:absolute;left:3660;top:67170;width:4514;height:1720;visibility:visible;mso-wrap-style:square;v-text-anchor:top" o:gfxdata="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" filled="f" stroked="f">
+                  <v:textbox inset="0,0,0,0">
+                    <w:txbxContent>
+                      <w:p>
+                        <w:pPr>
+                          <w:spacing w:after="160" w:line="259" w:lineRule="auto"/>
+                          <w:ind w:left="0" w:firstLine="0"/>
+                        </w:pPr>
+                        <w:r>
+                          <w:rPr>
+                            <w:sz w:val="20"/>
+                          </w:rPr>
+                          <w:t>Create</w:t>
+                        </w:r>
+                      </w:p>
+                    </w:txbxContent>
+                  </v:textbox>
+                </v:rect>
+                <v:rect id="Rectangle 76" o:spid="_x0000_s1099" style="position:absolute;left:7058;top:67170;width:381;height:1720;visibility:visible;mso-wrap-style:square;v-text-anchor:top" o:gfxdata="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" filled="f" stroked="f">
+                  <v:textbox inset="0,0,0,0">
+                    <w:txbxContent>
+                      <w:p>
+                        <w:pPr>
+                          <w:spacing w:after="160" w:line="259" w:lineRule="auto"/>
                           <w:ind w:left="0" w:firstLine="0"/>
                         </w:pPr>
                         <w:r>
@@ -5510,12 +5376,12 @@
                     </w:txbxContent>
                   </v:textbox>
                 </v:rect>
-                <v:rect id="Rectangle 77" style="position:absolute;width:381;height:1720;left:7375;top:67170;" filled="f" stroked="f">
-                  <v:textbox inset="0,0,0,0">
-                    <w:txbxContent>
-                      <w:p>
-                        <w:pPr>
-                          <w:spacing w:before="0" w:after="160" w:line="259" w:lineRule="auto"/>
+                <v:rect id="Rectangle 77" o:spid="_x0000_s1100" style="position:absolute;left:7375;top:67170;width:382;height:1720;visibility:visible;mso-wrap-style:square;v-text-anchor:top" o:gfxdata="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" filled="f" stroked="f">
+                  <v:textbox inset="0,0,0,0">
+                    <w:txbxContent>
+                      <w:p>
+                        <w:pPr>
+                          <w:spacing w:after="160" w:line="259" w:lineRule="auto"/>
                           <w:ind w:left="0" w:firstLine="0"/>
                         </w:pPr>
                         <w:r>
@@ -5528,30 +5394,30 @@
                     </w:txbxContent>
                   </v:textbox>
                 </v:rect>
-                <v:rect id="Rectangle 78" style="position:absolute;width:516;height:1720;left:927;top:69490;" filled="f" stroked="f">
-                  <v:textbox inset="0,0,0,0">
-                    <w:txbxContent>
-                      <w:p>
-                        <w:pPr>
-                          <w:spacing w:before="0" w:after="160" w:line="259" w:lineRule="auto"/>
-                          <w:ind w:left="0" w:firstLine="0"/>
-                        </w:pPr>
-                        <w:r>
-                          <w:rPr>
-                            <w:sz w:val="20"/>
-                          </w:rPr>
-                          <w:t xml:space="preserve">-</w:t>
-                        </w:r>
-                      </w:p>
-                    </w:txbxContent>
-                  </v:textbox>
-                </v:rect>
-                <v:rect id="Rectangle 79" style="position:absolute;width:381;height:1720;left:1311;top:69490;" filled="f" stroked="f">
-                  <v:textbox inset="0,0,0,0">
-                    <w:txbxContent>
-                      <w:p>
-                        <w:pPr>
-                          <w:spacing w:before="0" w:after="160" w:line="259" w:lineRule="auto"/>
+                <v:rect id="Rectangle 78" o:spid="_x0000_s1101" style="position:absolute;left:927;top:69490;width:516;height:1721;visibility:visible;mso-wrap-style:square;v-text-anchor:top" o:gfxdata="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" filled="f" stroked="f">
+                  <v:textbox inset="0,0,0,0">
+                    <w:txbxContent>
+                      <w:p>
+                        <w:pPr>
+                          <w:spacing w:after="160" w:line="259" w:lineRule="auto"/>
+                          <w:ind w:left="0" w:firstLine="0"/>
+                        </w:pPr>
+                        <w:r>
+                          <w:rPr>
+                            <w:sz w:val="20"/>
+                          </w:rPr>
+                          <w:t>-</w:t>
+                        </w:r>
+                      </w:p>
+                    </w:txbxContent>
+                  </v:textbox>
+                </v:rect>
+                <v:rect id="Rectangle 79" o:spid="_x0000_s1102" style="position:absolute;left:1311;top:69490;width:382;height:1721;visibility:visible;mso-wrap-style:square;v-text-anchor:top" o:gfxdata="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" filled="f" stroked="f">
+                  <v:textbox inset="0,0,0,0">
+                    <w:txbxContent>
+                      <w:p>
+                        <w:pPr>
+                          <w:spacing w:after="160" w:line="259" w:lineRule="auto"/>
                           <w:ind w:left="0" w:firstLine="0"/>
                         </w:pPr>
                         <w:r>
@@ -5564,12 +5430,12 @@
                     </w:txbxContent>
                   </v:textbox>
                 </v:rect>
-                <v:rect id="Rectangle 80" style="position:absolute;width:20473;height:1720;left:1597;top:69490;" filled="f" stroked="f">
-                  <v:textbox inset="0,0,0,0">
-                    <w:txbxContent>
-                      <w:p>
-                        <w:pPr>
-                          <w:spacing w:before="0" w:after="160" w:line="259" w:lineRule="auto"/>
+                <v:rect id="Rectangle 80" o:spid="_x0000_s1103" style="position:absolute;left:1597;top:69490;width:20473;height:1721;visibility:visible;mso-wrap-style:square;v-text-anchor:top" o:gfxdata="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" filled="f" stroked="f">
+                  <v:textbox inset="0,0,0,0">
+                    <w:txbxContent>
+                      <w:p>
+                        <w:pPr>
+                          <w:spacing w:after="160" w:line="259" w:lineRule="auto"/>
                           <w:ind w:left="0" w:firstLine="0"/>
                         </w:pPr>
                         <w:r>
@@ -5582,12 +5448,12 @@
                     </w:txbxContent>
                   </v:textbox>
                 </v:rect>
-                <v:rect id="Rectangle 81" style="position:absolute;width:8820;height:1720;left:927;top:71808;" filled="f" stroked="f">
-                  <v:textbox inset="0,0,0,0">
-                    <w:txbxContent>
-                      <w:p>
-                        <w:pPr>
-                          <w:spacing w:before="0" w:after="160" w:line="259" w:lineRule="auto"/>
+                <v:rect id="Rectangle 81" o:spid="_x0000_s1104" style="position:absolute;left:927;top:71808;width:8820;height:1720;visibility:visible;mso-wrap-style:square;v-text-anchor:top" o:gfxdata="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" filled="f" stroked="f">
+                  <v:textbox inset="0,0,0,0">
+                    <w:txbxContent>
+                      <w:p>
+                        <w:pPr>
+                          <w:spacing w:after="160" w:line="259" w:lineRule="auto"/>
                           <w:ind w:left="0" w:firstLine="0"/>
                         </w:pPr>
                         <w:r>
@@ -5600,66 +5466,68 @@
                     </w:txbxContent>
                   </v:textbox>
                 </v:rect>
-                <v:rect id="Rectangle 82" style="position:absolute;width:1575;height:1720;left:7566;top:71808;" filled="f" stroked="f">
-                  <v:textbox inset="0,0,0,0">
-                    <w:txbxContent>
-                      <w:p>
-                        <w:pPr>
-                          <w:spacing w:before="0" w:after="160" w:line="259" w:lineRule="auto"/>
-                          <w:ind w:left="0" w:firstLine="0"/>
-                        </w:pPr>
-                        <w:r>
-                          <w:rPr>
-                            <w:sz w:val="20"/>
-                          </w:rPr>
-                          <w:t xml:space="preserve">Ex</w:t>
-                        </w:r>
-                      </w:p>
-                    </w:txbxContent>
-                  </v:textbox>
-                </v:rect>
-                <v:rect id="Rectangle 83" style="position:absolute;width:714;height:1720;left:8743;top:71808;" filled="f" stroked="f">
-                  <v:textbox inset="0,0,0,0">
-                    <w:txbxContent>
-                      <w:p>
-                        <w:pPr>
-                          <w:spacing w:before="0" w:after="160" w:line="259" w:lineRule="auto"/>
-                          <w:ind w:left="0" w:firstLine="0"/>
-                        </w:pPr>
-                        <w:r>
-                          <w:rPr>
-                            <w:sz w:val="20"/>
-                          </w:rPr>
-                          <w:t xml:space="preserve">c</w:t>
-                        </w:r>
-                      </w:p>
-                    </w:txbxContent>
-                  </v:textbox>
-                </v:rect>
-                <v:rect id="Rectangle 84" style="position:absolute;width:1233;height:1720;left:9283;top:71808;" filled="f" stroked="f">
-                  <v:textbox inset="0,0,0,0">
-                    <w:txbxContent>
-                      <w:p>
-                        <w:pPr>
-                          <w:spacing w:before="0" w:after="160" w:line="259" w:lineRule="auto"/>
-                          <w:ind w:left="0" w:firstLine="0"/>
-                        </w:pPr>
-                        <w:r>
-                          <w:rPr>
-                            <w:sz w:val="20"/>
-                          </w:rPr>
-                          <w:t xml:space="preserve">el</w:t>
-                        </w:r>
-                      </w:p>
-                    </w:txbxContent>
-                  </v:textbox>
-                </v:rect>
-                <v:rect id="Rectangle 85" style="position:absolute;width:381;height:1720;left:10172;top:71808;" filled="f" stroked="f">
-                  <v:textbox inset="0,0,0,0">
-                    <w:txbxContent>
-                      <w:p>
-                        <w:pPr>
-                          <w:spacing w:before="0" w:after="160" w:line="259" w:lineRule="auto"/>
+                <v:rect id="Rectangle 82" o:spid="_x0000_s1105" style="position:absolute;left:7566;top:71808;width:1575;height:1720;visibility:visible;mso-wrap-style:square;v-text-anchor:top" o:gfxdata="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" filled="f" stroked="f">
+                  <v:textbox inset="0,0,0,0">
+                    <w:txbxContent>
+                      <w:p>
+                        <w:pPr>
+                          <w:spacing w:after="160" w:line="259" w:lineRule="auto"/>
+                          <w:ind w:left="0" w:firstLine="0"/>
+                        </w:pPr>
+                        <w:r>
+                          <w:rPr>
+                            <w:sz w:val="20"/>
+                          </w:rPr>
+                          <w:t>Ex</w:t>
+                        </w:r>
+                      </w:p>
+                    </w:txbxContent>
+                  </v:textbox>
+                </v:rect>
+                <v:rect id="Rectangle 83" o:spid="_x0000_s1106" style="position:absolute;left:8743;top:71808;width:715;height:1720;visibility:visible;mso-wrap-style:square;v-text-anchor:top" o:gfxdata="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" filled="f" stroked="f">
+                  <v:textbox inset="0,0,0,0">
+                    <w:txbxContent>
+                      <w:p>
+                        <w:pPr>
+                          <w:spacing w:after="160" w:line="259" w:lineRule="auto"/>
+                          <w:ind w:left="0" w:firstLine="0"/>
+                        </w:pPr>
+                        <w:r>
+                          <w:rPr>
+                            <w:sz w:val="20"/>
+                          </w:rPr>
+                          <w:t>c</w:t>
+                        </w:r>
+                      </w:p>
+                    </w:txbxContent>
+                  </v:textbox>
+                </v:rect>
+                <v:rect id="Rectangle 84" o:spid="_x0000_s1107" style="position:absolute;left:9283;top:71808;width:1233;height:1720;visibility:visible;mso-wrap-style:square;v-text-anchor:top" o:gfxdata="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" filled="f" stroked="f">
+                  <v:textbox inset="0,0,0,0">
+                    <w:txbxContent>
+                      <w:p>
+                        <w:pPr>
+                          <w:spacing w:after="160" w:line="259" w:lineRule="auto"/>
+                          <w:ind w:left="0" w:firstLine="0"/>
+                        </w:pPr>
+                        <w:proofErr w:type="spellStart"/>
+                        <w:r>
+                          <w:rPr>
+                            <w:sz w:val="20"/>
+                          </w:rPr>
+                          <w:t>el</w:t>
+                        </w:r>
+                        <w:proofErr w:type="spellEnd"/>
+                      </w:p>
+                    </w:txbxContent>
+                  </v:textbox>
+                </v:rect>
+                <v:rect id="Rectangle 85" o:spid="_x0000_s1108" style="position:absolute;left:10172;top:71808;width:382;height:1720;visibility:visible;mso-wrap-style:square;v-text-anchor:top" o:gfxdata="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" filled="f" stroked="f">
+                  <v:textbox inset="0,0,0,0">
+                    <w:txbxContent>
+                      <w:p>
+                        <w:pPr>
+                          <w:spacing w:after="160" w:line="259" w:lineRule="auto"/>
                           <w:ind w:left="0" w:firstLine="0"/>
                         </w:pPr>
                         <w:r>
@@ -5672,12 +5540,12 @@
                     </w:txbxContent>
                   </v:textbox>
                 </v:rect>
-                <v:rect id="Rectangle 86" style="position:absolute;width:381;height:1720;left:927;top:74126;" filled="f" stroked="f">
-                  <v:textbox inset="0,0,0,0">
-                    <w:txbxContent>
-                      <w:p>
-                        <w:pPr>
-                          <w:spacing w:before="0" w:after="160" w:line="259" w:lineRule="auto"/>
+                <v:rect id="Rectangle 86" o:spid="_x0000_s1109" style="position:absolute;left:927;top:74126;width:381;height:1720;visibility:visible;mso-wrap-style:square;v-text-anchor:top" o:gfxdata="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" filled="f" stroked="f">
+                  <v:textbox inset="0,0,0,0">
+                    <w:txbxContent>
+                      <w:p>
+                        <w:pPr>
+                          <w:spacing w:after="160" w:line="259" w:lineRule="auto"/>
                           <w:ind w:left="0" w:firstLine="0"/>
                         </w:pPr>
                         <w:r>
@@ -5690,38 +5558,36 @@
                     </w:txbxContent>
                   </v:textbox>
                 </v:rect>
-                <v:rect id="Rectangle 87" style="position:absolute;width:12258;height:2408;left:927;top:76602;" filled="f" stroked="f">
-                  <v:textbox inset="0,0,0,0">
-                    <w:txbxContent>
-                      <w:p>
-                        <w:pPr>
-                          <w:spacing w:before="0" w:after="160" w:line="259" w:lineRule="auto"/>
-                          <w:ind w:left="0" w:firstLine="0"/>
-                        </w:pPr>
-                        <w:r>
-                          <w:rPr>
-                            <w:rFonts w:cs="Calibri" w:hAnsi="Calibri" w:eastAsia="Calibri" w:ascii="Calibri"/>
-                            <w:b w:val="1"/>
+                <v:rect id="Rectangle 87" o:spid="_x0000_s1110" style="position:absolute;left:927;top:76602;width:12258;height:2409;visibility:visible;mso-wrap-style:square;v-text-anchor:top" o:gfxdata="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" filled="f" stroked="f">
+                  <v:textbox inset="0,0,0,0">
+                    <w:txbxContent>
+                      <w:p>
+                        <w:pPr>
+                          <w:spacing w:after="160" w:line="259" w:lineRule="auto"/>
+                          <w:ind w:left="0" w:firstLine="0"/>
+                        </w:pPr>
+                        <w:r>
+                          <w:rPr>
+                            <w:b/>
                             <w:sz w:val="28"/>
                           </w:rPr>
-                          <w:t xml:space="preserve">LANGUAGES</w:t>
-                        </w:r>
-                      </w:p>
-                    </w:txbxContent>
-                  </v:textbox>
-                </v:rect>
-                <v:rect id="Rectangle 88" style="position:absolute;width:534;height:2408;left:10140;top:76602;" filled="f" stroked="f">
-                  <v:textbox inset="0,0,0,0">
-                    <w:txbxContent>
-                      <w:p>
-                        <w:pPr>
-                          <w:spacing w:before="0" w:after="160" w:line="259" w:lineRule="auto"/>
-                          <w:ind w:left="0" w:firstLine="0"/>
-                        </w:pPr>
-                        <w:r>
-                          <w:rPr>
-                            <w:rFonts w:cs="Calibri" w:hAnsi="Calibri" w:eastAsia="Calibri" w:ascii="Calibri"/>
-                            <w:b w:val="1"/>
+                          <w:t>LANGUAGES</w:t>
+                        </w:r>
+                      </w:p>
+                    </w:txbxContent>
+                  </v:textbox>
+                </v:rect>
+                <v:rect id="Rectangle 88" o:spid="_x0000_s1111" style="position:absolute;left:10140;top:76602;width:535;height:2409;visibility:visible;mso-wrap-style:square;v-text-anchor:top" o:gfxdata="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" filled="f" stroked="f">
+                  <v:textbox inset="0,0,0,0">
+                    <w:txbxContent>
+                      <w:p>
+                        <w:pPr>
+                          <w:spacing w:after="160" w:line="259" w:lineRule="auto"/>
+                          <w:ind w:left="0" w:firstLine="0"/>
+                        </w:pPr>
+                        <w:r>
+                          <w:rPr>
+                            <w:b/>
                             <w:sz w:val="28"/>
                           </w:rPr>
                           <w:t xml:space="preserve"> </w:t>
@@ -5730,30 +5596,30 @@
                     </w:txbxContent>
                   </v:textbox>
                 </v:rect>
-                <v:rect id="Rectangle 89" style="position:absolute;width:516;height:1720;left:927;top:79714;" filled="f" stroked="f">
-                  <v:textbox inset="0,0,0,0">
-                    <w:txbxContent>
-                      <w:p>
-                        <w:pPr>
-                          <w:spacing w:before="0" w:after="160" w:line="259" w:lineRule="auto"/>
-                          <w:ind w:left="0" w:firstLine="0"/>
-                        </w:pPr>
-                        <w:r>
-                          <w:rPr>
-                            <w:sz w:val="20"/>
-                          </w:rPr>
-                          <w:t xml:space="preserve">-</w:t>
-                        </w:r>
-                      </w:p>
-                    </w:txbxContent>
-                  </v:textbox>
-                </v:rect>
-                <v:rect id="Rectangle 90" style="position:absolute;width:381;height:1720;left:1311;top:79714;" filled="f" stroked="f">
-                  <v:textbox inset="0,0,0,0">
-                    <w:txbxContent>
-                      <w:p>
-                        <w:pPr>
-                          <w:spacing w:before="0" w:after="160" w:line="259" w:lineRule="auto"/>
+                <v:rect id="Rectangle 89" o:spid="_x0000_s1112" style="position:absolute;left:927;top:79714;width:516;height:1720;visibility:visible;mso-wrap-style:square;v-text-anchor:top" o:gfxdata="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" filled="f" stroked="f">
+                  <v:textbox inset="0,0,0,0">
+                    <w:txbxContent>
+                      <w:p>
+                        <w:pPr>
+                          <w:spacing w:after="160" w:line="259" w:lineRule="auto"/>
+                          <w:ind w:left="0" w:firstLine="0"/>
+                        </w:pPr>
+                        <w:r>
+                          <w:rPr>
+                            <w:sz w:val="20"/>
+                          </w:rPr>
+                          <w:t>-</w:t>
+                        </w:r>
+                      </w:p>
+                    </w:txbxContent>
+                  </v:textbox>
+                </v:rect>
+                <v:rect id="Rectangle 90" o:spid="_x0000_s1113" style="position:absolute;left:1311;top:79714;width:382;height:1720;visibility:visible;mso-wrap-style:square;v-text-anchor:top" o:gfxdata="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" filled="f" stroked="f">
+                  <v:textbox inset="0,0,0,0">
+                    <w:txbxContent>
+                      <w:p>
+                        <w:pPr>
+                          <w:spacing w:after="160" w:line="259" w:lineRule="auto"/>
                           <w:ind w:left="0" w:firstLine="0"/>
                         </w:pPr>
                         <w:r>
@@ -5766,30 +5632,30 @@
                     </w:txbxContent>
                   </v:textbox>
                 </v:rect>
-                <v:rect id="Rectangle 91" style="position:absolute;width:5427;height:1720;left:1597;top:79714;" filled="f" stroked="f">
-                  <v:textbox inset="0,0,0,0">
-                    <w:txbxContent>
-                      <w:p>
-                        <w:pPr>
-                          <w:spacing w:before="0" w:after="160" w:line="259" w:lineRule="auto"/>
-                          <w:ind w:left="0" w:firstLine="0"/>
-                        </w:pPr>
-                        <w:r>
-                          <w:rPr>
-                            <w:sz w:val="20"/>
-                          </w:rPr>
-                          <w:t xml:space="preserve">Hebrew</w:t>
-                        </w:r>
-                      </w:p>
-                    </w:txbxContent>
-                  </v:textbox>
-                </v:rect>
-                <v:rect id="Rectangle 92" style="position:absolute;width:381;height:1720;left:5692;top:79714;" filled="f" stroked="f">
-                  <v:textbox inset="0,0,0,0">
-                    <w:txbxContent>
-                      <w:p>
-                        <w:pPr>
-                          <w:spacing w:before="0" w:after="160" w:line="259" w:lineRule="auto"/>
+                <v:rect id="Rectangle 91" o:spid="_x0000_s1114" style="position:absolute;left:1597;top:79714;width:5427;height:1720;visibility:visible;mso-wrap-style:square;v-text-anchor:top" o:gfxdata="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" filled="f" stroked="f">
+                  <v:textbox inset="0,0,0,0">
+                    <w:txbxContent>
+                      <w:p>
+                        <w:pPr>
+                          <w:spacing w:after="160" w:line="259" w:lineRule="auto"/>
+                          <w:ind w:left="0" w:firstLine="0"/>
+                        </w:pPr>
+                        <w:r>
+                          <w:rPr>
+                            <w:sz w:val="20"/>
+                          </w:rPr>
+                          <w:t>Hebrew</w:t>
+                        </w:r>
+                      </w:p>
+                    </w:txbxContent>
+                  </v:textbox>
+                </v:rect>
+                <v:rect id="Rectangle 92" o:spid="_x0000_s1115" style="position:absolute;left:5692;top:79714;width:382;height:1720;visibility:visible;mso-wrap-style:square;v-text-anchor:top" o:gfxdata="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" filled="f" stroked="f">
+                  <v:textbox inset="0,0,0,0">
+                    <w:txbxContent>
+                      <w:p>
+                        <w:pPr>
+                          <w:spacing w:after="160" w:line="259" w:lineRule="auto"/>
                           <w:ind w:left="0" w:firstLine="0"/>
                         </w:pPr>
                         <w:r>
@@ -5802,30 +5668,30 @@
                     </w:txbxContent>
                   </v:textbox>
                 </v:rect>
-                <v:rect id="Rectangle 93" style="position:absolute;width:516;height:1720;left:927;top:82035;" filled="f" stroked="f">
-                  <v:textbox inset="0,0,0,0">
-                    <w:txbxContent>
-                      <w:p>
-                        <w:pPr>
-                          <w:spacing w:before="0" w:after="160" w:line="259" w:lineRule="auto"/>
-                          <w:ind w:left="0" w:firstLine="0"/>
-                        </w:pPr>
-                        <w:r>
-                          <w:rPr>
-                            <w:sz w:val="20"/>
-                          </w:rPr>
-                          <w:t xml:space="preserve">-</w:t>
-                        </w:r>
-                      </w:p>
-                    </w:txbxContent>
-                  </v:textbox>
-                </v:rect>
-                <v:rect id="Rectangle 94" style="position:absolute;width:381;height:1720;left:1311;top:82035;" filled="f" stroked="f">
-                  <v:textbox inset="0,0,0,0">
-                    <w:txbxContent>
-                      <w:p>
-                        <w:pPr>
-                          <w:spacing w:before="0" w:after="160" w:line="259" w:lineRule="auto"/>
+                <v:rect id="Rectangle 93" o:spid="_x0000_s1116" style="position:absolute;left:927;top:82035;width:516;height:1721;visibility:visible;mso-wrap-style:square;v-text-anchor:top" o:gfxdata="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" filled="f" stroked="f">
+                  <v:textbox inset="0,0,0,0">
+                    <w:txbxContent>
+                      <w:p>
+                        <w:pPr>
+                          <w:spacing w:after="160" w:line="259" w:lineRule="auto"/>
+                          <w:ind w:left="0" w:firstLine="0"/>
+                        </w:pPr>
+                        <w:r>
+                          <w:rPr>
+                            <w:sz w:val="20"/>
+                          </w:rPr>
+                          <w:t>-</w:t>
+                        </w:r>
+                      </w:p>
+                    </w:txbxContent>
+                  </v:textbox>
+                </v:rect>
+                <v:rect id="Rectangle 94" o:spid="_x0000_s1117" style="position:absolute;left:1311;top:82035;width:382;height:1721;visibility:visible;mso-wrap-style:square;v-text-anchor:top" o:gfxdata="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" filled="f" stroked="f">
+                  <v:textbox inset="0,0,0,0">
+                    <w:txbxContent>
+                      <w:p>
+                        <w:pPr>
+                          <w:spacing w:after="160" w:line="259" w:lineRule="auto"/>
                           <w:ind w:left="0" w:firstLine="0"/>
                         </w:pPr>
                         <w:r>
@@ -5838,30 +5704,30 @@
                     </w:txbxContent>
                   </v:textbox>
                 </v:rect>
-                <v:rect id="Rectangle 95" style="position:absolute;width:4851;height:1720;left:1597;top:82035;" filled="f" stroked="f">
-                  <v:textbox inset="0,0,0,0">
-                    <w:txbxContent>
-                      <w:p>
-                        <w:pPr>
-                          <w:spacing w:before="0" w:after="160" w:line="259" w:lineRule="auto"/>
-                          <w:ind w:left="0" w:firstLine="0"/>
-                        </w:pPr>
-                        <w:r>
-                          <w:rPr>
-                            <w:sz w:val="20"/>
-                          </w:rPr>
-                          <w:t xml:space="preserve">English</w:t>
-                        </w:r>
-                      </w:p>
-                    </w:txbxContent>
-                  </v:textbox>
-                </v:rect>
-                <v:rect id="Rectangle 96" style="position:absolute;width:381;height:1720;left:5248;top:82035;" filled="f" stroked="f">
-                  <v:textbox inset="0,0,0,0">
-                    <w:txbxContent>
-                      <w:p>
-                        <w:pPr>
-                          <w:spacing w:before="0" w:after="160" w:line="259" w:lineRule="auto"/>
+                <v:rect id="Rectangle 95" o:spid="_x0000_s1118" style="position:absolute;left:1597;top:82035;width:4851;height:1721;visibility:visible;mso-wrap-style:square;v-text-anchor:top" o:gfxdata="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" filled="f" stroked="f">
+                  <v:textbox inset="0,0,0,0">
+                    <w:txbxContent>
+                      <w:p>
+                        <w:pPr>
+                          <w:spacing w:after="160" w:line="259" w:lineRule="auto"/>
+                          <w:ind w:left="0" w:firstLine="0"/>
+                        </w:pPr>
+                        <w:r>
+                          <w:rPr>
+                            <w:sz w:val="20"/>
+                          </w:rPr>
+                          <w:t>English</w:t>
+                        </w:r>
+                      </w:p>
+                    </w:txbxContent>
+                  </v:textbox>
+                </v:rect>
+                <v:rect id="Rectangle 96" o:spid="_x0000_s1119" style="position:absolute;left:5248;top:82035;width:382;height:1721;visibility:visible;mso-wrap-style:square;v-text-anchor:top" o:gfxdata="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" filled="f" stroked="f">
+                  <v:textbox inset="0,0,0,0">
+                    <w:txbxContent>
+                      <w:p>
+                        <w:pPr>
+                          <w:spacing w:after="160" w:line="259" w:lineRule="auto"/>
                           <w:ind w:left="0" w:firstLine="0"/>
                         </w:pPr>
                         <w:r>
@@ -5874,12 +5740,12 @@
                     </w:txbxContent>
                   </v:textbox>
                 </v:rect>
-                <v:rect id="Rectangle 97" style="position:absolute;width:381;height:1720;left:927;top:84385;" filled="f" stroked="f">
-                  <v:textbox inset="0,0,0,0">
-                    <w:txbxContent>
-                      <w:p>
-                        <w:pPr>
-                          <w:spacing w:before="0" w:after="160" w:line="259" w:lineRule="auto"/>
+                <v:rect id="Rectangle 97" o:spid="_x0000_s1120" style="position:absolute;left:927;top:84385;width:381;height:1720;visibility:visible;mso-wrap-style:square;v-text-anchor:top" o:gfxdata="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" filled="f" stroked="f">
+                  <v:textbox inset="0,0,0,0">
+                    <w:txbxContent>
+                      <w:p>
+                        <w:pPr>
+                          <w:spacing w:after="160" w:line="259" w:lineRule="auto"/>
                           <w:ind w:left="0" w:firstLine="0"/>
                         </w:pPr>
                         <w:r>
@@ -5892,57 +5758,76 @@
                     </w:txbxContent>
                   </v:textbox>
                 </v:rect>
-                <v:shape id="Picture 99" style="position:absolute;width:1365;height:1365;left:1111;top:18954;" filled="f">
-                  <v:imagedata r:id="rId9"/>
+                <v:shapetype id="_x0000_t75" coordsize="21600,21600" o:spt="75" o:preferrelative="t" path="m@4@5l@4@11@9@11@9@5xe" filled="f" stroked="f">
+                  <v:stroke joinstyle="miter"/>
+                  <v:formulas>
+                    <v:f eqn="if lineDrawn pixelLineWidth 0"/>
+                    <v:f eqn="sum @0 1 0"/>
+                    <v:f eqn="sum 0 0 @1"/>
+                    <v:f eqn="prod @2 1 2"/>
+                    <v:f eqn="prod @3 21600 pixelWidth"/>
+                    <v:f eqn="prod @3 21600 pixelHeight"/>
+                    <v:f eqn="sum @0 0 1"/>
+                    <v:f eqn="prod @6 1 2"/>
+                    <v:f eqn="prod @7 21600 pixelWidth"/>
+                    <v:f eqn="sum @8 21600 0"/>
+                    <v:f eqn="prod @7 21600 pixelHeight"/>
+                    <v:f eqn="sum @10 21600 0"/>
+                  </v:formulas>
+                  <v:path o:extrusionok="f" gradientshapeok="t" o:connecttype="rect"/>
+                  <o:lock v:ext="edit" aspectratio="t"/>
+                </v:shapetype>
+                <v:shape id="Picture 99" o:spid="_x0000_s1121" type="#_x0000_t75" style="position:absolute;left:1111;top:18954;width:1365;height:1366;visibility:visible;mso-wrap-style:square" o:gfxdata="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">
+                  <v:imagedata r:id="rId7" o:title=""/>
                 </v:shape>
-                <v:shape id="Picture 101" style="position:absolute;width:1365;height:1905;left:1149;top:25336;" filled="f">
-                  <v:imagedata r:id="rId10"/>
+                <v:shape id="Picture 101" o:spid="_x0000_s1122" type="#_x0000_t75" style="position:absolute;left:1149;top:25336;width:1365;height:1905;visibility:visible;mso-wrap-style:square" o:gfxdata="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">
+                  <v:imagedata r:id="rId8" o:title=""/>
                 </v:shape>
-                <v:shape id="Picture 103" style="position:absolute;width:1365;height:1587;left:1098;top:22117;" filled="f">
-                  <v:imagedata r:id="rId11"/>
+                <v:shape id="Picture 103" o:spid="_x0000_s1123" type="#_x0000_t75" style="position:absolute;left:1098;top:22117;width:1365;height:1587;visibility:visible;mso-wrap-style:square" o:gfxdata="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">
+                  <v:imagedata r:id="rId9" o:title=""/>
                 </v:shape>
-                <v:rect id="Rectangle 104" style="position:absolute;width:841;height:1720;left:3597;top:19151;" filled="f" stroked="f">
-                  <v:textbox inset="0,0,0,0">
-                    <w:txbxContent>
-                      <w:p>
-                        <w:pPr>
-                          <w:spacing w:before="0" w:after="160" w:line="259" w:lineRule="auto"/>
-                          <w:ind w:left="0" w:firstLine="0"/>
-                        </w:pPr>
-                        <w:r>
-                          <w:rPr>
-                            <w:sz w:val="20"/>
-                          </w:rPr>
-                          <w:t xml:space="preserve">+</w:t>
-                        </w:r>
-                      </w:p>
-                    </w:txbxContent>
-                  </v:textbox>
-                </v:rect>
-                <v:rect id="Rectangle 105" style="position:absolute;width:11367;height:1720;left:4232;top:19151;" filled="f" stroked="f">
-                  <v:textbox inset="0,0,0,0">
-                    <w:txbxContent>
-                      <w:p>
-                        <w:pPr>
-                          <w:spacing w:before="0" w:after="160" w:line="259" w:lineRule="auto"/>
-                          <w:ind w:left="0" w:firstLine="0"/>
-                        </w:pPr>
-                        <w:r>
-                          <w:rPr>
-                            <w:sz w:val="20"/>
-                          </w:rPr>
-                          <w:t xml:space="preserve">972 54 428 9938</w:t>
-                        </w:r>
-                      </w:p>
-                    </w:txbxContent>
-                  </v:textbox>
-                </v:rect>
-                <v:rect id="Rectangle 106" style="position:absolute;width:381;height:1720;left:12807;top:19151;" filled="f" stroked="f">
-                  <v:textbox inset="0,0,0,0">
-                    <w:txbxContent>
-                      <w:p>
-                        <w:pPr>
-                          <w:spacing w:before="0" w:after="160" w:line="259" w:lineRule="auto"/>
+                <v:rect id="Rectangle 104" o:spid="_x0000_s1124" style="position:absolute;left:3597;top:19151;width:841;height:1721;visibility:visible;mso-wrap-style:square;v-text-anchor:top" o:gfxdata="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" filled="f" stroked="f">
+                  <v:textbox inset="0,0,0,0">
+                    <w:txbxContent>
+                      <w:p>
+                        <w:pPr>
+                          <w:spacing w:after="160" w:line="259" w:lineRule="auto"/>
+                          <w:ind w:left="0" w:firstLine="0"/>
+                        </w:pPr>
+                        <w:r>
+                          <w:rPr>
+                            <w:sz w:val="20"/>
+                          </w:rPr>
+                          <w:t>+</w:t>
+                        </w:r>
+                      </w:p>
+                    </w:txbxContent>
+                  </v:textbox>
+                </v:rect>
+                <v:rect id="Rectangle 105" o:spid="_x0000_s1125" style="position:absolute;left:4232;top:19151;width:11367;height:1721;visibility:visible;mso-wrap-style:square;v-text-anchor:top" o:gfxdata="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" filled="f" stroked="f">
+                  <v:textbox inset="0,0,0,0">
+                    <w:txbxContent>
+                      <w:p>
+                        <w:pPr>
+                          <w:spacing w:after="160" w:line="259" w:lineRule="auto"/>
+                          <w:ind w:left="0" w:firstLine="0"/>
+                        </w:pPr>
+                        <w:r>
+                          <w:rPr>
+                            <w:sz w:val="20"/>
+                          </w:rPr>
+                          <w:t>972 54 428 9938</w:t>
+                        </w:r>
+                      </w:p>
+                    </w:txbxContent>
+                  </v:textbox>
+                </v:rect>
+                <v:rect id="Rectangle 106" o:spid="_x0000_s1126" style="position:absolute;left:12807;top:19151;width:382;height:1721;visibility:visible;mso-wrap-style:square;v-text-anchor:top" o:gfxdata="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" filled="f" stroked="f">
+                  <v:textbox inset="0,0,0,0">
+                    <w:txbxContent>
+                      <w:p>
+                        <w:pPr>
+                          <w:spacing w:after="160" w:line="259" w:lineRule="auto"/>
                           <w:ind w:left="0" w:firstLine="0"/>
                         </w:pPr>
                         <w:r>
@@ -5955,66 +5840,66 @@
                     </w:txbxContent>
                   </v:textbox>
                 </v:rect>
-                <v:rect id="Rectangle 107" style="position:absolute;width:1118;height:1720;left:3629;top:22485;" filled="f" stroked="f">
-                  <v:textbox inset="0,0,0,0">
-                    <w:txbxContent>
-                      <w:p>
-                        <w:pPr>
-                          <w:spacing w:before="0" w:after="160" w:line="259" w:lineRule="auto"/>
-                          <w:ind w:left="0" w:firstLine="0"/>
-                        </w:pPr>
-                        <w:r>
-                          <w:rPr>
-                            <w:sz w:val="20"/>
-                          </w:rPr>
-                          <w:t xml:space="preserve">O</w:t>
-                        </w:r>
-                      </w:p>
-                    </w:txbxContent>
-                  </v:textbox>
-                </v:rect>
-                <v:rect id="Rectangle 108" style="position:absolute;width:7484;height:1720;left:4486;top:22485;" filled="f" stroked="f">
-                  <v:textbox inset="0,0,0,0">
-                    <w:txbxContent>
-                      <w:p>
-                        <w:pPr>
-                          <w:spacing w:before="0" w:after="160" w:line="259" w:lineRule="auto"/>
-                          <w:ind w:left="0" w:firstLine="0"/>
-                        </w:pPr>
-                        <w:r>
-                          <w:rPr>
-                            <w:sz w:val="20"/>
-                          </w:rPr>
-                          <w:t xml:space="preserve">renhen345</w:t>
-                        </w:r>
-                      </w:p>
-                    </w:txbxContent>
-                  </v:textbox>
-                </v:rect>
-                <v:rect id="Rectangle 109" style="position:absolute;width:8612;height:1720;left:10109;top:22485;" filled="f" stroked="f">
-                  <v:textbox inset="0,0,0,0">
-                    <w:txbxContent>
-                      <w:p>
-                        <w:pPr>
-                          <w:spacing w:before="0" w:after="160" w:line="259" w:lineRule="auto"/>
-                          <w:ind w:left="0" w:firstLine="0"/>
-                        </w:pPr>
-                        <w:r>
-                          <w:rPr>
-                            <w:sz w:val="20"/>
-                          </w:rPr>
-                          <w:t xml:space="preserve">@gmail.com</w:t>
-                        </w:r>
-                      </w:p>
-                    </w:txbxContent>
-                  </v:textbox>
-                </v:rect>
-                <v:rect id="Rectangle 110" style="position:absolute;width:381;height:1720;left:16590;top:22485;" filled="f" stroked="f">
-                  <v:textbox inset="0,0,0,0">
-                    <w:txbxContent>
-                      <w:p>
-                        <w:pPr>
-                          <w:spacing w:before="0" w:after="160" w:line="259" w:lineRule="auto"/>
+                <v:rect id="Rectangle 107" o:spid="_x0000_s1127" style="position:absolute;left:3629;top:22485;width:1118;height:1720;visibility:visible;mso-wrap-style:square;v-text-anchor:top" o:gfxdata="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" filled="f" stroked="f">
+                  <v:textbox inset="0,0,0,0">
+                    <w:txbxContent>
+                      <w:p>
+                        <w:pPr>
+                          <w:spacing w:after="160" w:line="259" w:lineRule="auto"/>
+                          <w:ind w:left="0" w:firstLine="0"/>
+                        </w:pPr>
+                        <w:r>
+                          <w:rPr>
+                            <w:sz w:val="20"/>
+                          </w:rPr>
+                          <w:t>O</w:t>
+                        </w:r>
+                      </w:p>
+                    </w:txbxContent>
+                  </v:textbox>
+                </v:rect>
+                <v:rect id="Rectangle 108" o:spid="_x0000_s1128" style="position:absolute;left:4486;top:22485;width:7484;height:1720;visibility:visible;mso-wrap-style:square;v-text-anchor:top" o:gfxdata="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" filled="f" stroked="f">
+                  <v:textbox inset="0,0,0,0">
+                    <w:txbxContent>
+                      <w:p>
+                        <w:pPr>
+                          <w:spacing w:after="160" w:line="259" w:lineRule="auto"/>
+                          <w:ind w:left="0" w:firstLine="0"/>
+                        </w:pPr>
+                        <w:r>
+                          <w:rPr>
+                            <w:sz w:val="20"/>
+                          </w:rPr>
+                          <w:t>renhen345</w:t>
+                        </w:r>
+                      </w:p>
+                    </w:txbxContent>
+                  </v:textbox>
+                </v:rect>
+                <v:rect id="Rectangle 109" o:spid="_x0000_s1129" style="position:absolute;left:10109;top:22485;width:8612;height:1720;visibility:visible;mso-wrap-style:square;v-text-anchor:top" o:gfxdata="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" filled="f" stroked="f">
+                  <v:textbox inset="0,0,0,0">
+                    <w:txbxContent>
+                      <w:p>
+                        <w:pPr>
+                          <w:spacing w:after="160" w:line="259" w:lineRule="auto"/>
+                          <w:ind w:left="0" w:firstLine="0"/>
+                        </w:pPr>
+                        <w:r>
+                          <w:rPr>
+                            <w:sz w:val="20"/>
+                          </w:rPr>
+                          <w:t>@gmail.com</w:t>
+                        </w:r>
+                      </w:p>
+                    </w:txbxContent>
+                  </v:textbox>
+                </v:rect>
+                <v:rect id="Rectangle 110" o:spid="_x0000_s1130" style="position:absolute;left:16590;top:22485;width:381;height:1720;visibility:visible;mso-wrap-style:square;v-text-anchor:top" o:gfxdata="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" filled="f" stroked="f">
+                  <v:textbox inset="0,0,0,0">
+                    <w:txbxContent>
+                      <w:p>
+                        <w:pPr>
+                          <w:spacing w:after="160" w:line="259" w:lineRule="auto"/>
                           <w:ind w:left="0" w:firstLine="0"/>
                         </w:pPr>
                         <w:r>
@@ -6027,48 +5912,48 @@
                     </w:txbxContent>
                   </v:textbox>
                 </v:rect>
-                <v:rect id="Rectangle 111" style="position:absolute;width:6915;height:1720;left:3787;top:25819;" filled="f" stroked="f">
-                  <v:textbox inset="0,0,0,0">
-                    <w:txbxContent>
-                      <w:p>
-                        <w:pPr>
-                          <w:spacing w:before="0" w:after="160" w:line="259" w:lineRule="auto"/>
-                          <w:ind w:left="0" w:firstLine="0"/>
-                        </w:pPr>
-                        <w:r>
-                          <w:rPr>
-                            <w:sz w:val="20"/>
-                          </w:rPr>
-                          <w:t xml:space="preserve">Jerusalem</w:t>
-                        </w:r>
-                      </w:p>
-                    </w:txbxContent>
-                  </v:textbox>
-                </v:rect>
-                <v:rect id="Rectangle 112" style="position:absolute;width:4521;height:1720;left:8997;top:25819;" filled="f" stroked="f">
-                  <v:textbox inset="0,0,0,0">
-                    <w:txbxContent>
-                      <w:p>
-                        <w:pPr>
-                          <w:spacing w:before="0" w:after="160" w:line="259" w:lineRule="auto"/>
-                          <w:ind w:left="0" w:firstLine="0"/>
-                        </w:pPr>
-                        <w:r>
-                          <w:rPr>
-                            <w:sz w:val="20"/>
-                          </w:rPr>
-                          <w:t xml:space="preserve">, Israel</w:t>
-                        </w:r>
-                      </w:p>
-                    </w:txbxContent>
-                  </v:textbox>
-                </v:rect>
-                <v:rect id="Rectangle 113" style="position:absolute;width:381;height:1720;left:12395;top:25819;" filled="f" stroked="f">
-                  <v:textbox inset="0,0,0,0">
-                    <w:txbxContent>
-                      <w:p>
-                        <w:pPr>
-                          <w:spacing w:before="0" w:after="160" w:line="259" w:lineRule="auto"/>
+                <v:rect id="Rectangle 111" o:spid="_x0000_s1131" style="position:absolute;left:3787;top:25819;width:6915;height:1720;visibility:visible;mso-wrap-style:square;v-text-anchor:top" o:gfxdata="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" filled="f" stroked="f">
+                  <v:textbox inset="0,0,0,0">
+                    <w:txbxContent>
+                      <w:p>
+                        <w:pPr>
+                          <w:spacing w:after="160" w:line="259" w:lineRule="auto"/>
+                          <w:ind w:left="0" w:firstLine="0"/>
+                        </w:pPr>
+                        <w:r>
+                          <w:rPr>
+                            <w:sz w:val="20"/>
+                          </w:rPr>
+                          <w:t>Jerusalem</w:t>
+                        </w:r>
+                      </w:p>
+                    </w:txbxContent>
+                  </v:textbox>
+                </v:rect>
+                <v:rect id="Rectangle 112" o:spid="_x0000_s1132" style="position:absolute;left:8997;top:25819;width:4522;height:1720;visibility:visible;mso-wrap-style:square;v-text-anchor:top" o:gfxdata="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" filled="f" stroked="f">
+                  <v:textbox inset="0,0,0,0">
+                    <w:txbxContent>
+                      <w:p>
+                        <w:pPr>
+                          <w:spacing w:after="160" w:line="259" w:lineRule="auto"/>
+                          <w:ind w:left="0" w:firstLine="0"/>
+                        </w:pPr>
+                        <w:r>
+                          <w:rPr>
+                            <w:sz w:val="20"/>
+                          </w:rPr>
+                          <w:t>, Israel</w:t>
+                        </w:r>
+                      </w:p>
+                    </w:txbxContent>
+                  </v:textbox>
+                </v:rect>
+                <v:rect id="Rectangle 113" o:spid="_x0000_s1133" style="position:absolute;left:12395;top:25819;width:381;height:1720;visibility:visible;mso-wrap-style:square;v-text-anchor:top" o:gfxdata="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" filled="f" stroked="f">
+                  <v:textbox inset="0,0,0,0">
+                    <w:txbxContent>
+                      <w:p>
+                        <w:pPr>
+                          <w:spacing w:after="160" w:line="259" w:lineRule="auto"/>
                           <w:ind w:left="0" w:firstLine="0"/>
                         </w:pPr>
                         <w:r>
@@ -6081,12 +5966,12 @@
                     </w:txbxContent>
                   </v:textbox>
                 </v:rect>
-                <v:rect id="Rectangle 114" style="position:absolute;width:381;height:1720;left:12649;top:25819;" filled="f" stroked="f">
-                  <v:textbox inset="0,0,0,0">
-                    <w:txbxContent>
-                      <w:p>
-                        <w:pPr>
-                          <w:spacing w:before="0" w:after="160" w:line="259" w:lineRule="auto"/>
+                <v:rect id="Rectangle 114" o:spid="_x0000_s1134" style="position:absolute;left:12649;top:25819;width:381;height:1720;visibility:visible;mso-wrap-style:square;v-text-anchor:top" o:gfxdata="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" filled="f" stroked="f">
+                  <v:textbox inset="0,0,0,0">
+                    <w:txbxContent>
+                      <w:p>
+                        <w:pPr>
+                          <w:spacing w:after="160" w:line="259" w:lineRule="auto"/>
                           <w:ind w:left="0" w:firstLine="0"/>
                         </w:pPr>
                         <w:r>
@@ -6099,18 +5984,18 @@
                     </w:txbxContent>
                   </v:textbox>
                 </v:rect>
-                <v:rect id="Rectangle 115" style="position:absolute;width:19825;height:7208;left:2009;top:5178;" filled="f" stroked="f">
-                  <v:textbox inset="0,0,0,0">
-                    <w:txbxContent>
-                      <w:p>
-                        <w:pPr>
-                          <w:spacing w:before="0" w:after="160" w:line="259" w:lineRule="auto"/>
-                          <w:ind w:left="0" w:firstLine="0"/>
-                        </w:pPr>
-                        <w:r>
-                          <w:rPr>
-                            <w:rFonts w:cs="Britannic" w:hAnsi="Britannic" w:eastAsia="Britannic" w:ascii="Britannic"/>
-                            <w:b w:val="1"/>
+                <v:rect id="Rectangle 115" o:spid="_x0000_s1135" style="position:absolute;left:2009;top:5178;width:19826;height:7209;visibility:visible;mso-wrap-style:square;v-text-anchor:top" o:gfxdata="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" filled="f" stroked="f">
+                  <v:textbox inset="0,0,0,0">
+                    <w:txbxContent>
+                      <w:p>
+                        <w:pPr>
+                          <w:spacing w:after="160" w:line="259" w:lineRule="auto"/>
+                          <w:ind w:left="0" w:firstLine="0"/>
+                        </w:pPr>
+                        <w:r>
+                          <w:rPr>
+                            <w:rFonts w:ascii="Britannic" w:eastAsia="Britannic" w:hAnsi="Britannic" w:cs="Britannic"/>
+                            <w:b/>
                             <w:sz w:val="96"/>
                           </w:rPr>
                           <w:t xml:space="preserve">Oren </w:t>
@@ -6119,38 +6004,38 @@
                     </w:txbxContent>
                   </v:textbox>
                 </v:rect>
-                <v:rect id="Rectangle 116" style="position:absolute;width:13984;height:7208;left:2009;top:11912;" filled="f" stroked="f">
-                  <v:textbox inset="0,0,0,0">
-                    <w:txbxContent>
-                      <w:p>
-                        <w:pPr>
-                          <w:spacing w:before="0" w:after="160" w:line="259" w:lineRule="auto"/>
-                          <w:ind w:left="0" w:firstLine="0"/>
-                        </w:pPr>
-                        <w:r>
-                          <w:rPr>
-                            <w:rFonts w:cs="Britannic" w:hAnsi="Britannic" w:eastAsia="Britannic" w:ascii="Britannic"/>
-                            <w:b w:val="1"/>
+                <v:rect id="Rectangle 116" o:spid="_x0000_s1136" style="position:absolute;left:2009;top:11912;width:13985;height:7209;visibility:visible;mso-wrap-style:square;v-text-anchor:top" o:gfxdata="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" filled="f" stroked="f">
+                  <v:textbox inset="0,0,0,0">
+                    <w:txbxContent>
+                      <w:p>
+                        <w:pPr>
+                          <w:spacing w:after="160" w:line="259" w:lineRule="auto"/>
+                          <w:ind w:left="0" w:firstLine="0"/>
+                        </w:pPr>
+                        <w:r>
+                          <w:rPr>
+                            <w:rFonts w:ascii="Britannic" w:eastAsia="Britannic" w:hAnsi="Britannic" w:cs="Britannic"/>
+                            <w:b/>
                             <w:sz w:val="96"/>
                           </w:rPr>
-                          <w:t xml:space="preserve">Hen</w:t>
-                        </w:r>
-                      </w:p>
-                    </w:txbxContent>
-                  </v:textbox>
-                </v:rect>
-                <v:rect id="Rectangle 117" style="position:absolute;width:2433;height:7208;left:12522;top:11912;" filled="f" stroked="f">
-                  <v:textbox inset="0,0,0,0">
-                    <w:txbxContent>
-                      <w:p>
-                        <w:pPr>
-                          <w:spacing w:before="0" w:after="160" w:line="259" w:lineRule="auto"/>
-                          <w:ind w:left="0" w:firstLine="0"/>
-                        </w:pPr>
-                        <w:r>
-                          <w:rPr>
-                            <w:rFonts w:cs="Britannic" w:hAnsi="Britannic" w:eastAsia="Britannic" w:ascii="Britannic"/>
-                            <w:b w:val="1"/>
+                          <w:t>Hen</w:t>
+                        </w:r>
+                      </w:p>
+                    </w:txbxContent>
+                  </v:textbox>
+                </v:rect>
+                <v:rect id="Rectangle 117" o:spid="_x0000_s1137" style="position:absolute;left:12522;top:11912;width:2433;height:7209;visibility:visible;mso-wrap-style:square;v-text-anchor:top" o:gfxdata="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" filled="f" stroked="f">
+                  <v:textbox inset="0,0,0,0">
+                    <w:txbxContent>
+                      <w:p>
+                        <w:pPr>
+                          <w:spacing w:after="160" w:line="259" w:lineRule="auto"/>
+                          <w:ind w:left="0" w:firstLine="0"/>
+                        </w:pPr>
+                        <w:r>
+                          <w:rPr>
+                            <w:rFonts w:ascii="Britannic" w:eastAsia="Britannic" w:hAnsi="Britannic" w:cs="Britannic"/>
+                            <w:b/>
                             <w:sz w:val="96"/>
                           </w:rPr>
                           <w:t xml:space="preserve"> </w:t>
@@ -6159,12 +6044,241 @@
                     </w:txbxContent>
                   </v:textbox>
                 </v:rect>
-                <w10:wrap type="square"/>
+                <w10:wrap type="square" anchorx="page" anchory="page"/>
               </v:group>
             </w:pict>
           </mc:Fallback>
         </mc:AlternateContent>
       </w:r>
+      <w:r>
+        <w:rPr>
+          <w:noProof/>
+          <w:sz w:val="32"/>
+          <w:szCs w:val="32"/>
+        </w:rPr>
+        <w:t>Animation</w:t>
+      </w:r>
+      <w:r>
+        <w:rPr>
+          <w:rFonts w:ascii="Miriam" w:eastAsia="Miriam" w:hAnsi="Miriam" w:cs="Miriam"/>
+          <w:sz w:val="32"/>
+        </w:rPr>
+        <w:t xml:space="preserve"> &amp; Motion Designer </w:t>
+      </w:r>
+    </w:p>
+    <w:p>
+      <w:pPr>
+        <w:spacing w:line="240" w:lineRule="auto"/>
+        <w:ind w:left="10"/>
+      </w:pPr>
+      <w:r>
+        <w:t xml:space="preserve">2D/3D animator specializing in motion graphics, visual storytelling, and AI-assisted animation workflows. </w:t>
+      </w:r>
+    </w:p>
+    <w:p>
+      <w:pPr>
+        <w:spacing w:line="240" w:lineRule="auto"/>
+        <w:ind w:left="10"/>
+      </w:pPr>
+      <w:r>
+        <w:t xml:space="preserve">Experienced with After Effects, Maya, Blender, </w:t>
+      </w:r>
+      <w:r>
+        <w:t xml:space="preserve">Comfy UI </w:t>
+      </w:r>
+      <w:r>
+        <w:t xml:space="preserve">and </w:t>
+      </w:r>
+      <w:r>
+        <w:t xml:space="preserve">other </w:t>
+      </w:r>
+      <w:r>
+        <w:t xml:space="preserve">generative AI tools for creative production. </w:t>
+      </w:r>
+    </w:p>
+    <w:p>
+      <w:pPr>
+        <w:spacing w:after="77" w:line="240" w:lineRule="auto"/>
+        <w:ind w:left="0" w:firstLine="0"/>
+      </w:pPr>
+    </w:p>
+    <w:p>
+      <w:pPr>
+        <w:spacing w:after="39" w:line="240" w:lineRule="auto"/>
+        <w:ind w:left="3427" w:firstLine="0"/>
+        <w:jc w:val="both"/>
+      </w:pPr>
+      <w:hyperlink r:id="rId10" w:history="1">
+        <w:r>
+          <w:rPr>
+            <w:rStyle w:val="Hyperlink"/>
+          </w:rPr>
+          <w:t>My Portfolio</w:t>
+        </w:r>
+      </w:hyperlink>
+      <w:r>
+        <w:t xml:space="preserve"> </w:t>
+      </w:r>
+    </w:p>
+    <w:p>
+      <w:pPr>
+        <w:spacing w:after="138" w:line="240" w:lineRule="auto"/>
+        <w:ind w:left="0" w:firstLine="0"/>
+      </w:pPr>
+    </w:p>
+    <w:p>
+      <w:pPr>
+        <w:pStyle w:val="Heading1"/>
+        <w:spacing w:line="240" w:lineRule="auto"/>
+        <w:ind w:left="10"/>
+      </w:pPr>
+      <w:r>
+        <w:t>EXPERIENCE</w:t>
+      </w:r>
+      <w:r>
+        <w:rPr>
+          <w:rFonts w:ascii="Arial" w:eastAsia="Arial" w:hAnsi="Arial" w:cs="Arial"/>
+          <w:b w:val="0"/>
+        </w:rPr>
+        <w:t xml:space="preserve"> </w:t>
+      </w:r>
+    </w:p>
+    <w:p>
+      <w:pPr>
+        <w:spacing w:after="12" w:line="240" w:lineRule="auto"/>
+        <w:ind w:left="3427" w:firstLine="0"/>
+      </w:pPr>
+      <w:r>
+        <w:rPr>
+          <w:rFonts w:ascii="Britannic" w:eastAsia="Britannic" w:hAnsi="Britannic" w:cs="Britannic"/>
+          <w:b/>
+          <w:sz w:val="32"/>
+        </w:rPr>
+        <w:t xml:space="preserve"> </w:t>
+      </w:r>
+    </w:p>
+    <w:p>
+      <w:pPr>
+        <w:spacing w:after="15" w:line="240" w:lineRule="auto"/>
+        <w:ind w:left="3427" w:firstLine="0"/>
+      </w:pPr>
+      <w:r>
+        <w:rPr>
+          <w:b/>
+          <w:sz w:val="28"/>
+        </w:rPr>
+        <w:t>Freelance</w:t>
+      </w:r>
+      <w:r>
+        <w:rPr>
+          <w:sz w:val="28"/>
+        </w:rPr>
+        <w:t xml:space="preserve"> </w:t>
+      </w:r>
+    </w:p>
+    <w:p>
+      <w:pPr>
+        <w:spacing w:line="240" w:lineRule="auto"/>
+        <w:ind w:left="10"/>
+      </w:pPr>
+      <w:proofErr w:type="spellStart"/>
+      <w:r>
+        <w:t>Moofa</w:t>
+      </w:r>
+      <w:proofErr w:type="spellEnd"/>
+      <w:r>
+        <w:t xml:space="preserve"> Studio</w:t>
+      </w:r>
+      <w:r>
+        <w:rPr>
+          <w:sz w:val="28"/>
+        </w:rPr>
+        <w:t xml:space="preserve"> </w:t>
+      </w:r>
+    </w:p>
+    <w:p>
+      <w:pPr>
+        <w:pStyle w:val="Heading2"/>
+        <w:spacing w:after="0" w:line="240" w:lineRule="auto"/>
+        <w:ind w:left="10"/>
+      </w:pPr>
+      <w:r>
+        <w:rPr>
+          <w:b w:val="0"/>
+          <w:i/>
+        </w:rPr>
+        <w:t>2025 - Present</w:t>
+      </w:r>
+      <w:r>
+        <w:rPr>
+          <w:b w:val="0"/>
+          <w:sz w:val="28"/>
+        </w:rPr>
+        <w:t xml:space="preserve"> </w:t>
+      </w:r>
+    </w:p>
+    <w:p>
+      <w:pPr>
+        <w:spacing w:line="240" w:lineRule="auto"/>
+        <w:ind w:left="10"/>
+      </w:pPr>
+      <w:r>
+        <w:t>Develop animated content using a workflow that combines classical animation, After Effects, and AI-based generative tools. Translate creative concepts into visual sequences through staging, animation, and editing, while exploring AI-assisted creative processes alongside studies in the Animation Department at Bezalel Academy of Arts and Design.</w:t>
+      </w:r>
+      <w:r>
+        <w:rPr>
+          <w:rFonts w:ascii="Arial" w:eastAsia="Arial" w:hAnsi="Arial" w:cs="Arial"/>
+        </w:rPr>
+        <w:t xml:space="preserve"> </w:t>
+      </w:r>
+    </w:p>
+    <w:p>
+      <w:pPr>
+        <w:spacing w:after="19" w:line="240" w:lineRule="auto"/>
+        <w:ind w:left="3427" w:firstLine="0"/>
+      </w:pPr>
+      <w:r>
+        <w:t xml:space="preserve"> </w:t>
+      </w:r>
+    </w:p>
+    <w:p>
+      <w:pPr>
+        <w:pStyle w:val="Heading2"/>
+        <w:spacing w:line="240" w:lineRule="auto"/>
+        <w:ind w:left="10"/>
+      </w:pPr>
+      <w:r>
+        <w:t xml:space="preserve">Student Mentorship </w:t>
+      </w:r>
+    </w:p>
+    <w:p>
+      <w:pPr>
+        <w:pStyle w:val="Heading3"/>
+        <w:spacing w:line="240" w:lineRule="auto"/>
+        <w:ind w:left="10"/>
+      </w:pPr>
+      <w:r>
+        <w:t>2025- present</w:t>
+      </w:r>
+      <w:r>
+        <w:rPr>
+          <w:b/>
+          <w:i w:val="0"/>
+        </w:rPr>
+        <w:t xml:space="preserve"> </w:t>
+      </w:r>
+      <w:r>
+        <w:rPr>
+          <w:i w:val="0"/>
+        </w:rPr>
+        <w:t xml:space="preserve"> </w:t>
+      </w:r>
+    </w:p>
+    <w:p>
+      <w:pPr>
+        <w:spacing w:line="240" w:lineRule="auto"/>
+        <w:ind w:left="10"/>
+      </w:pPr>
       <w:r>
         <w:rPr>
           <w:b/>
@@ -6177,7 +6291,7 @@
     </w:p>
     <w:p>
       <w:pPr>
-        <w:spacing w:after="27" w:line="259" w:lineRule="auto"/>
+        <w:spacing w:after="27" w:line="240" w:lineRule="auto"/>
         <w:ind w:left="3427" w:firstLine="0"/>
       </w:pPr>
       <w:r>
@@ -6190,6 +6304,7 @@
     <w:p>
       <w:pPr>
         <w:pStyle w:val="Heading2"/>
+        <w:spacing w:line="240" w:lineRule="auto"/>
         <w:ind w:left="10"/>
       </w:pPr>
       <w:r>
@@ -6205,6 +6320,7 @@
     <w:p>
       <w:pPr>
         <w:pStyle w:val="Heading3"/>
+        <w:spacing w:line="240" w:lineRule="auto"/>
         <w:ind w:left="10"/>
       </w:pPr>
       <w:r>
@@ -6225,6 +6341,7 @@
     </w:p>
     <w:p>
       <w:pPr>
+        <w:spacing w:line="240" w:lineRule="auto"/>
         <w:ind w:left="10"/>
       </w:pPr>
       <w:r>
@@ -6233,6 +6350,7 @@
     </w:p>
     <w:p>
       <w:pPr>
+        <w:spacing w:line="240" w:lineRule="auto"/>
         <w:ind w:left="10"/>
       </w:pPr>
       <w:r>
@@ -6247,7 +6365,7 @@
     </w:p>
     <w:p>
       <w:pPr>
-        <w:spacing w:after="32" w:line="259" w:lineRule="auto"/>
+        <w:spacing w:after="32" w:line="240" w:lineRule="auto"/>
         <w:ind w:left="3427" w:firstLine="0"/>
       </w:pPr>
       <w:r>
@@ -6260,6 +6378,7 @@
     <w:p>
       <w:pPr>
         <w:pStyle w:val="Heading2"/>
+        <w:spacing w:line="240" w:lineRule="auto"/>
         <w:ind w:left="10"/>
       </w:pPr>
       <w:r>
@@ -6284,6 +6403,7 @@
     <w:p>
       <w:pPr>
         <w:pStyle w:val="Heading3"/>
+        <w:spacing w:line="240" w:lineRule="auto"/>
         <w:ind w:left="10"/>
       </w:pPr>
       <w:r>
@@ -6292,7 +6412,12 @@
     </w:p>
     <w:p>
       <w:pPr>
+        <w:spacing w:line="240" w:lineRule="auto"/>
         <w:ind w:left="10" w:right="205"/>
+        <w:rPr>
+          <w:rFonts w:ascii="Arial" w:eastAsia="Arial" w:hAnsi="Arial" w:cs="Arial"/>
+          <w:rtl/>
+        </w:rPr>
       </w:pPr>
       <w:r>
         <w:rPr>
@@ -6312,20 +6437,17 @@
     </w:p>
     <w:p>
       <w:pPr>
-        <w:spacing w:after="84" w:line="259" w:lineRule="auto"/>
-        <w:ind w:left="3427" w:firstLine="0"/>
+        <w:spacing w:line="240" w:lineRule="auto"/>
+        <w:ind w:left="10" w:right="205"/>
       </w:pPr>
-      <w:r>
-        <w:t xml:space="preserve"> </w:t>
-      </w:r>
     </w:p>
     <w:p>
       <w:pPr>
         <w:pStyle w:val="Heading1"/>
+        <w:spacing w:line="240" w:lineRule="auto"/>
         <w:ind w:left="10"/>
       </w:pPr>
       <w:r>
-        <w:lastRenderedPageBreak/>
         <w:t>EDUCATION</w:t>
       </w:r>
       <w:r>
@@ -6339,6 +6461,7 @@
     <w:p>
       <w:pPr>
         <w:pStyle w:val="Heading2"/>
+        <w:spacing w:line="240" w:lineRule="auto"/>
         <w:ind w:left="10"/>
       </w:pPr>
       <w:r>
@@ -6347,6 +6470,7 @@
     </w:p>
     <w:p>
       <w:pPr>
+        <w:spacing w:line="240" w:lineRule="auto"/>
         <w:ind w:left="10"/>
       </w:pPr>
       <w:r>
@@ -6355,6 +6479,7 @@
     </w:p>
     <w:p>
       <w:pPr>
+        <w:spacing w:line="240" w:lineRule="auto"/>
         <w:ind w:left="10"/>
       </w:pPr>
       <w:r>
@@ -6375,8 +6500,9 @@
     </w:p>
     <w:sectPr>
       <w:pgSz w:w="11905" w:h="16840"/>
-      <w:pgMar w:top="1440" w:right="677" w:bottom="1440" w:left="1440" w:header="720" w:footer="720" w:gutter="0"/>
+      <w:pgMar w:top="720" w:right="720" w:bottom="720" w:left="720" w:header="720" w:footer="720" w:gutter="0"/>
       <w:cols w:space="720"/>
+      <w:docGrid w:linePitch="326"/>
     </w:sectPr>
   </w:body>
 </w:document>
@@ -6908,6 +7034,29 @@
       <w:sz w:val="24"/>
     </w:rPr>
   </w:style>
+  <w:style w:type="character" w:styleId="Hyperlink">
+    <w:name w:val="Hyperlink"/>
+    <w:basedOn w:val="DefaultParagraphFont"/>
+    <w:uiPriority w:val="99"/>
+    <w:unhideWhenUsed/>
+    <w:rsid w:val="00AD0D8E"/>
+    <w:rPr>
+      <w:color w:val="467886" w:themeColor="hyperlink"/>
+      <w:u w:val="single"/>
+    </w:rPr>
+  </w:style>
+  <w:style w:type="character" w:styleId="UnresolvedMention">
+    <w:name w:val="Unresolved Mention"/>
+    <w:basedOn w:val="DefaultParagraphFont"/>
+    <w:uiPriority w:val="99"/>
+    <w:semiHidden/>
+    <w:unhideWhenUsed/>
+    <w:rsid w:val="00AD0D8E"/>
+    <w:rPr>
+      <w:color w:val="605E5C"/>
+      <w:shd w:val="clear" w:color="auto" w:fill="E1DFDD"/>
+    </w:rPr>
+  </w:style>
 </w:styles>
 </file>
 

</xml_diff>